<commit_message>
tex2docx: stack side-by-side columns that contain boxes (no clipping in Word)
Co-Authored-By: Claude Opus 5.5 <noreply@anthropic.com>
Claude-Session: https://claude.ai/code/session_015WVgZKTbSWpZTjn6aZsqC9
</commit_message>
<xml_diff>
--- a/documents/integrales/molakhas_integ_3as.docx
+++ b/documents/integrales/molakhas_integ_3as.docx
@@ -19353,169 +19353,220 @@
     </w:p>
     <w:tbl>
       <w:tblPr>
-        <w:tblW w:w="9977" w:type="dxa"/>
+        <w:tblW w:w="9864" w:type="dxa"/>
         <w:jc w:val="center"/>
         <w:tblBorders>
-          <w:top w:val="nil" w:sz="0" w:space="0" w:color="FFFFFF"/>
-          <w:left w:val="nil" w:sz="0" w:space="0" w:color="FFFFFF"/>
-          <w:bottom w:val="nil" w:sz="0" w:space="0" w:color="FFFFFF"/>
-          <w:right w:val="nil" w:sz="0" w:space="0" w:color="FFFFFF"/>
-          <w:insideH w:val="nil" w:sz="0" w:space="0" w:color="FFFFFF"/>
-          <w:insideV w:val="nil" w:sz="0" w:space="0" w:color="FFFFFF"/>
+          <w:top w:val="single" w:sz="10" w:space="0" w:color="9F5600"/>
+          <w:left w:val="single" w:sz="10" w:space="0" w:color="9F5600"/>
+          <w:bottom w:val="single" w:sz="10" w:space="0" w:color="9F5600"/>
+          <w:right w:val="single" w:sz="10" w:space="0" w:color="9F5600"/>
+          <w:insideH w:val="single" w:sz="10" w:space="0" w:color="9F5600"/>
         </w:tblBorders>
         <w:tblLayout w:type="fixed"/>
+        <w:tblCellMar>
+          <w:top w:w="40" w:type="dxa"/>
+          <w:left w:w="140" w:type="dxa"/>
+          <w:bottom w:w="60" w:type="dxa"/>
+          <w:right w:w="140" w:type="dxa"/>
+        </w:tblCellMar>
       </w:tblPr>
       <w:tblGrid>
-        <w:gridCol w:w="4988"/>
-        <w:gridCol w:w="4988"/>
+        <w:gridCol w:w="9864"/>
       </w:tblGrid>
+      <w:tr>
+        <w:trPr>
+          <w:cantSplit/>
+        </w:trPr>
+        <w:tc>
+          <w:tcPr>
+            <w:tcW w:w="9864" w:type="dxa"/>
+            <w:shd w:val="clear" w:color="auto" w:fill="9F5600"/>
+          </w:tcPr>
+          <w:p>
+            <w:pPr>
+              <w:keepNext/>
+              <w:bidi/>
+              <w:spacing w:before="0" w:after="0"/>
+            </w:pPr>
+            <w:r>
+              <w:rPr>
+                <w:b/>
+                <w:bCs/>
+                <w:color w:val="FFFFFF"/>
+                <w:rtl/>
+              </w:rPr>
+              <w:t xml:space="preserve">مثال</w:t>
+            </w:r>
+          </w:p>
+        </w:tc>
+      </w:tr>
       <w:tr>
         <w:tc>
           <w:tcPr>
-            <w:tcW w:w="4988" w:type="dxa"/>
+            <w:tcW w:w="9864" w:type="dxa"/>
+            <w:shd w:val="clear" w:color="auto" w:fill="FCF8F2"/>
           </w:tcPr>
           <w:p>
             <w:pPr>
               <w:bidi/>
-              <w:jc w:val="center"/>
             </w:pPr>
             <w:r>
               <w:rPr>
                 <w:rtl/>
               </w:rPr>
-              <w:drawing>
-                <wp:inline>
-                  <wp:extent cx="1732788" cy="1664208"/>
-                  <wp:docPr id="3" name="Picture 3"/>
-                  <wp:cNvGraphicFramePr>
-                    <a:graphicFrameLocks noChangeAspect="1"/>
-                  </wp:cNvGraphicFramePr>
-                  <a:graphic>
-                    <a:graphicData uri="http://schemas.openxmlformats.org/drawingml/2006/picture">
-                      <pic:pic>
-                        <pic:nvPicPr>
-                          <pic:cNvPr id="0" name="d453c6b4b463d8e4.png"/>
-                          <pic:cNvPicPr/>
-                        </pic:nvPicPr>
-                        <pic:blipFill>
-                          <a:blip r:embed="rId11"/>
-                          <a:stretch>
-                            <a:fillRect/>
-                          </a:stretch>
-                        </pic:blipFill>
-                        <pic:spPr>
-                          <a:xfrm>
-                            <a:off x="0" y="0"/>
-                            <a:ext cx="1732788" cy="1664208"/>
-                          </a:xfrm>
-                          <a:prstGeom prst="rect"/>
-                        </pic:spPr>
-                      </pic:pic>
-                    </a:graphicData>
-                  </a:graphic>
-                </wp:inline>
-              </w:drawing>
+              <w:t xml:space="preserve">القيمة المتوسطة للدالة</w:t>
+            </w:r>
+            <w:r>
+              <w:rPr>
+                <w:rtl/>
+              </w:rPr>
+              <w:t xml:space="preserve"> </w:t>
+            </w:r>
+            <m:oMath>
+              <m:r>
+                <m:t>f</m:t>
+              </m:r>
+              <m:d>
+                <m:dPr>
+                  <m:begChr m:val="("/>
+                  <m:endChr m:val=")"/>
+                  <m:sepChr m:val=""/>
+                  <m:grow/>
+                </m:dPr>
+                <m:e>
+                  <m:r>
+                    <m:t>x</m:t>
+                  </m:r>
+                </m:e>
+              </m:d>
+              <m:r>
+                <m:rPr>
+                  <m:sty m:val="p"/>
+                </m:rPr>
+                <m:t>=</m:t>
+              </m:r>
+              <m:sSup>
+                <m:e>
+                  <m:r>
+                    <m:t>x</m:t>
+                  </m:r>
+                </m:e>
+                <m:sup>
+                  <m:r>
+                    <m:t>2</m:t>
+                  </m:r>
+                </m:sup>
+              </m:sSup>
+            </m:oMath>
+            <w:r>
+              <w:rPr>
+                <w:rtl/>
+              </w:rPr>
+              <w:t xml:space="preserve"> </w:t>
+            </w:r>
+            <w:r>
+              <w:rPr>
+                <w:rtl/>
+              </w:rPr>
+              <w:t xml:space="preserve">على</w:t>
+            </w:r>
+            <w:r>
+              <w:rPr>
+                <w:rtl/>
+              </w:rPr>
+              <w:t xml:space="preserve"> </w:t>
+            </w:r>
+            <m:oMath>
+              <m:d>
+                <m:dPr>
+                  <m:begChr m:val="["/>
+                  <m:endChr m:val="]"/>
+                  <m:sepChr m:val=""/>
+                  <m:grow/>
+                </m:dPr>
+                <m:e>
+                  <m:r>
+                    <m:t>0</m:t>
+                  </m:r>
+                  <m:r>
+                    <m:rPr>
+                      <m:sty m:val="p"/>
+                    </m:rPr>
+                    <m:t>;</m:t>
+                  </m:r>
+                  <m:r>
+                    <m:t>3</m:t>
+                  </m:r>
+                </m:e>
+              </m:d>
+            </m:oMath>
+            <w:r>
+              <w:rPr>
+                <w:rtl/>
+              </w:rPr>
+              <w:t xml:space="preserve">:</w:t>
             </w:r>
           </w:p>
-        </w:tc>
-        <w:tc>
-          <w:tcPr>
-            <w:tcW w:w="4988" w:type="dxa"/>
-          </w:tcPr>
-          <w:tbl>
-            <w:tblPr>
-              <w:tblW w:w="9864" w:type="dxa"/>
-              <w:jc w:val="center"/>
-              <w:tblBorders>
-                <w:top w:val="single" w:sz="10" w:space="0" w:color="9F5600"/>
-                <w:left w:val="single" w:sz="10" w:space="0" w:color="9F5600"/>
-                <w:bottom w:val="single" w:sz="10" w:space="0" w:color="9F5600"/>
-                <w:right w:val="single" w:sz="10" w:space="0" w:color="9F5600"/>
-                <w:insideH w:val="single" w:sz="10" w:space="0" w:color="9F5600"/>
-              </w:tblBorders>
-              <w:tblLayout w:type="fixed"/>
-              <w:tblCellMar>
-                <w:top w:w="40" w:type="dxa"/>
-                <w:left w:w="140" w:type="dxa"/>
-                <w:bottom w:w="60" w:type="dxa"/>
-                <w:right w:w="140" w:type="dxa"/>
-              </w:tblCellMar>
-            </w:tblPr>
-            <w:tblGrid>
-              <w:gridCol w:w="9864"/>
-            </w:tblGrid>
-            <w:tr>
-              <w:trPr>
-                <w:cantSplit/>
-              </w:trPr>
-              <w:tc>
-                <w:tcPr>
-                  <w:tcW w:w="9864" w:type="dxa"/>
-                  <w:shd w:val="clear" w:color="auto" w:fill="9F5600"/>
-                </w:tcPr>
-                <w:p>
-                  <w:pPr>
-                    <w:keepNext/>
-                    <w:bidi/>
-                    <w:spacing w:before="0" w:after="0"/>
-                  </w:pPr>
-                  <w:r>
-                    <w:rPr>
-                      <w:b/>
-                      <w:bCs/>
-                      <w:color w:val="FFFFFF"/>
-                      <w:rtl/>
-                    </w:rPr>
-                    <w:t xml:space="preserve">مثال</w:t>
-                  </w:r>
-                </w:p>
-              </w:tc>
-            </w:tr>
-            <w:tr>
-              <w:tc>
-                <w:tcPr>
-                  <w:tcW w:w="9864" w:type="dxa"/>
-                  <w:shd w:val="clear" w:color="auto" w:fill="FCF8F2"/>
-                </w:tcPr>
-                <w:p>
-                  <w:pPr>
-                    <w:bidi/>
-                  </w:pPr>
-                  <w:r>
-                    <w:rPr>
-                      <w:rtl/>
-                    </w:rPr>
-                    <w:t xml:space="preserve">القيمة المتوسطة للدالة</w:t>
-                  </w:r>
-                  <w:r>
-                    <w:rPr>
-                      <w:rtl/>
-                    </w:rPr>
-                    <w:t xml:space="preserve"> </w:t>
-                  </w:r>
-                  <m:oMath>
+          <w:p>
+            <w:pPr>
+              <w:bidi/>
+            </w:pPr>
+            <m:oMathPara>
+              <m:oMathParaPr>
+                <m:jc m:val="center"/>
+              </m:oMathParaPr>
+              <m:oMath>
+                <m:r>
+                  <m:t>m</m:t>
+                </m:r>
+                <m:r>
+                  <m:rPr>
+                    <m:sty m:val="p"/>
+                  </m:rPr>
+                  <m:t>=</m:t>
+                </m:r>
+                <m:f>
+                  <m:fPr>
+                    <m:type m:val="bar"/>
+                  </m:fPr>
+                  <m:num>
                     <m:r>
-                      <m:t>f</m:t>
+                      <m:t>1</m:t>
                     </m:r>
-                    <m:d>
-                      <m:dPr>
-                        <m:begChr m:val="("/>
-                        <m:endChr m:val=")"/>
-                        <m:sepChr m:val=""/>
-                        <m:grow/>
-                      </m:dPr>
-                      <m:e>
-                        <m:r>
-                          <m:t>x</m:t>
-                        </m:r>
-                      </m:e>
-                    </m:d>
+                  </m:num>
+                  <m:den>
+                    <m:r>
+                      <m:t>3</m:t>
+                    </m:r>
                     <m:r>
                       <m:rPr>
                         <m:sty m:val="p"/>
                       </m:rPr>
-                      <m:t>=</m:t>
+                      <m:t>−</m:t>
                     </m:r>
+                    <m:r>
+                      <m:t>0</m:t>
+                    </m:r>
+                  </m:den>
+                </m:f>
+                <m:nary>
+                  <m:naryPr>
+                    <m:chr m:val="∫"/>
+                    <m:limLoc m:val="subSup"/>
+                    <m:subHide m:val="off"/>
+                    <m:supHide m:val="off"/>
+                  </m:naryPr>
+                  <m:sub>
+                    <m:r>
+                      <m:t>0</m:t>
+                    </m:r>
+                  </m:sub>
+                  <m:sup>
+                    <m:r>
+                      <m:t>3</m:t>
+                    </m:r>
+                  </m:sup>
+                  <m:e>
                     <m:sSup>
                       <m:e>
                         <m:r>
@@ -19528,340 +19579,258 @@
                         </m:r>
                       </m:sup>
                     </m:sSup>
-                  </m:oMath>
-                  <w:r>
-                    <w:rPr>
-                      <w:rtl/>
-                    </w:rPr>
-                    <w:t xml:space="preserve"> </w:t>
-                  </w:r>
-                  <w:r>
-                    <w:rPr>
-                      <w:rtl/>
-                    </w:rPr>
-                    <w:t xml:space="preserve">على</w:t>
-                  </w:r>
-                  <w:r>
-                    <w:rPr>
-                      <w:rtl/>
-                    </w:rPr>
-                    <w:t xml:space="preserve"> </w:t>
-                  </w:r>
-                  <m:oMath>
-                    <m:d>
-                      <m:dPr>
-                        <m:begChr m:val="["/>
-                        <m:endChr m:val="]"/>
-                        <m:sepChr m:val=""/>
-                        <m:grow/>
-                      </m:dPr>
+                  </m:e>
+                </m:nary>
+                <m:r>
+                  <m:t> </m:t>
+                </m:r>
+                <m:r>
+                  <m:rPr>
+                    <m:sty m:val="p"/>
+                  </m:rPr>
+                  <m:t>d</m:t>
+                </m:r>
+                <m:r>
+                  <m:t>x</m:t>
+                </m:r>
+                <m:r>
+                  <m:rPr>
+                    <m:sty m:val="p"/>
+                  </m:rPr>
+                  <m:t>=</m:t>
+                </m:r>
+                <m:f>
+                  <m:fPr>
+                    <m:type m:val="bar"/>
+                  </m:fPr>
+                  <m:num>
+                    <m:r>
+                      <m:t>1</m:t>
+                    </m:r>
+                  </m:num>
+                  <m:den>
+                    <m:r>
+                      <m:t>3</m:t>
+                    </m:r>
+                  </m:den>
+                </m:f>
+                <m:r>
+                  <m:rPr>
+                    <m:sty m:val="p"/>
+                  </m:rPr>
+                  <m:t>[</m:t>
+                </m:r>
+                <m:f>
+                  <m:fPr>
+                    <m:type m:val="bar"/>
+                  </m:fPr>
+                  <m:num>
+                    <m:sSup>
                       <m:e>
                         <m:r>
-                          <m:t>0</m:t>
+                          <m:t>x</m:t>
                         </m:r>
-                        <m:r>
-                          <m:rPr>
-                            <m:sty m:val="p"/>
-                          </m:rPr>
-                          <m:t>;</m:t>
-                        </m:r>
+                      </m:e>
+                      <m:sup>
                         <m:r>
                           <m:t>3</m:t>
                         </m:r>
-                      </m:e>
-                    </m:d>
-                  </m:oMath>
-                  <w:r>
-                    <w:rPr>
-                      <w:rtl/>
-                    </w:rPr>
-                    <w:t xml:space="preserve">:</w:t>
-                  </w:r>
-                </w:p>
-                <w:p>
-                  <w:pPr>
-                    <w:bidi/>
-                  </w:pPr>
-                  <m:oMathPara>
-                    <m:oMathParaPr>
-                      <m:jc m:val="center"/>
-                    </m:oMathParaPr>
-                    <m:oMath>
-                      <m:r>
-                        <m:t>m</m:t>
-                      </m:r>
-                      <m:r>
-                        <m:rPr>
-                          <m:sty m:val="p"/>
-                        </m:rPr>
-                        <m:t>=</m:t>
-                      </m:r>
-                      <m:f>
-                        <m:fPr>
-                          <m:type m:val="bar"/>
-                        </m:fPr>
-                        <m:num>
-                          <m:r>
-                            <m:t>1</m:t>
-                          </m:r>
-                        </m:num>
-                        <m:den>
-                          <m:r>
-                            <m:t>3</m:t>
-                          </m:r>
-                          <m:r>
-                            <m:rPr>
-                              <m:sty m:val="p"/>
-                            </m:rPr>
-                            <m:t>−</m:t>
-                          </m:r>
-                          <m:r>
-                            <m:t>0</m:t>
-                          </m:r>
-                        </m:den>
-                      </m:f>
-                      <m:nary>
-                        <m:naryPr>
-                          <m:chr m:val="∫"/>
-                          <m:limLoc m:val="subSup"/>
-                          <m:subHide m:val="off"/>
-                          <m:supHide m:val="off"/>
-                        </m:naryPr>
-                        <m:sub>
-                          <m:r>
-                            <m:t>0</m:t>
-                          </m:r>
-                        </m:sub>
-                        <m:sup>
-                          <m:r>
-                            <m:t>3</m:t>
-                          </m:r>
-                        </m:sup>
-                        <m:e>
-                          <m:sSup>
-                            <m:e>
-                              <m:r>
-                                <m:t>x</m:t>
-                              </m:r>
-                            </m:e>
-                            <m:sup>
-                              <m:r>
-                                <m:t>2</m:t>
-                              </m:r>
-                            </m:sup>
-                          </m:sSup>
-                        </m:e>
-                      </m:nary>
-                      <m:r>
-                        <m:t> </m:t>
-                      </m:r>
-                      <m:r>
-                        <m:rPr>
-                          <m:sty m:val="p"/>
-                        </m:rPr>
-                        <m:t>d</m:t>
-                      </m:r>
-                      <m:r>
-                        <m:t>x</m:t>
-                      </m:r>
-                      <m:r>
-                        <m:rPr>
-                          <m:sty m:val="p"/>
-                        </m:rPr>
-                        <m:t>=</m:t>
-                      </m:r>
-                      <m:f>
-                        <m:fPr>
-                          <m:type m:val="bar"/>
-                        </m:fPr>
-                        <m:num>
-                          <m:r>
-                            <m:t>1</m:t>
-                          </m:r>
-                        </m:num>
-                        <m:den>
-                          <m:r>
-                            <m:t>3</m:t>
-                          </m:r>
-                        </m:den>
-                      </m:f>
-                      <m:r>
-                        <m:rPr>
-                          <m:sty m:val="p"/>
-                        </m:rPr>
-                        <m:t>[</m:t>
-                      </m:r>
-                      <m:f>
-                        <m:fPr>
-                          <m:type m:val="bar"/>
-                        </m:fPr>
-                        <m:num>
-                          <m:sSup>
-                            <m:e>
-                              <m:r>
-                                <m:t>x</m:t>
-                              </m:r>
-                            </m:e>
-                            <m:sup>
-                              <m:r>
-                                <m:t>3</m:t>
-                              </m:r>
-                            </m:sup>
-                          </m:sSup>
-                        </m:num>
-                        <m:den>
-                          <m:r>
-                            <m:t>3</m:t>
-                          </m:r>
-                        </m:den>
-                      </m:f>
-                      <m:sSubSup>
-                        <m:e>
-                          <m:r>
-                            <m:rPr>
-                              <m:sty m:val="p"/>
-                            </m:rPr>
-                            <m:t>]</m:t>
-                          </m:r>
-                        </m:e>
-                        <m:sub>
-                          <m:r>
-                            <m:t>0</m:t>
-                          </m:r>
-                        </m:sub>
-                        <m:sup>
-                          <m:r>
-                            <m:t>3</m:t>
-                          </m:r>
-                        </m:sup>
-                      </m:sSubSup>
-                      <m:r>
-                        <m:rPr>
-                          <m:sty m:val="p"/>
-                        </m:rPr>
-                        <m:t>=</m:t>
-                      </m:r>
-                      <m:f>
-                        <m:fPr>
-                          <m:type m:val="bar"/>
-                        </m:fPr>
-                        <m:num>
-                          <m:r>
-                            <m:t>1</m:t>
-                          </m:r>
-                        </m:num>
-                        <m:den>
-                          <m:r>
-                            <m:t>3</m:t>
-                          </m:r>
-                        </m:den>
-                      </m:f>
-                      <m:r>
-                        <m:rPr>
-                          <m:sty m:val="p"/>
-                        </m:rPr>
-                        <m:t>×</m:t>
-                      </m:r>
-                      <m:r>
-                        <m:t>9</m:t>
-                      </m:r>
-                      <m:r>
-                        <m:rPr>
-                          <m:sty m:val="p"/>
-                        </m:rPr>
-                        <m:t>=</m:t>
-                      </m:r>
-                      <m:borderBox>
-                        <m:e>
-                          <m:r>
-                            <m:t>3</m:t>
-                          </m:r>
-                        </m:e>
-                      </m:borderBox>
-                    </m:oMath>
-                  </m:oMathPara>
-                </w:p>
-                <w:p>
-                  <w:pPr>
-                    <w:bidi/>
-                  </w:pPr>
-                  <w:r>
-                    <w:rPr>
-                      <w:rtl/>
-                    </w:rPr>
-                    <w:t xml:space="preserve">المساحة تحت المنحني (</w:t>
-                  </w:r>
-                  <m:oMath>
+                      </m:sup>
+                    </m:sSup>
+                  </m:num>
+                  <m:den>
                     <m:r>
-                      <m:t>9</m:t>
+                      <m:t>3</m:t>
                     </m:r>
-                    <m:r>
-                      <m:t> </m:t>
-                    </m:r>
+                  </m:den>
+                </m:f>
+                <m:sSubSup>
+                  <m:e>
                     <m:r>
                       <m:rPr>
                         <m:sty m:val="p"/>
                       </m:rPr>
-                      <m:t>u</m:t>
+                      <m:t>]</m:t>
                     </m:r>
+                  </m:e>
+                  <m:sub>
                     <m:r>
-                      <m:rPr>
-                        <m:sty m:val="p"/>
-                      </m:rPr>
-                      <m:t>.</m:t>
+                      <m:t>0</m:t>
                     </m:r>
-                    <m:r>
-                      <m:rPr>
-                        <m:sty m:val="p"/>
-                      </m:rPr>
-                      <m:t>a</m:t>
-                    </m:r>
-                  </m:oMath>
-                  <w:r>
-                    <w:rPr>
-                      <w:rtl/>
-                    </w:rPr>
-                    <w:t xml:space="preserve">) تساوي مساحة المستطيل</w:t>
-                  </w:r>
-                  <w:r>
-                    <w:rPr>
-                      <w:rtl/>
-                    </w:rPr>
-                    <w:t xml:space="preserve"> </w:t>
-                  </w:r>
-                  <m:oMath>
+                  </m:sub>
+                  <m:sup>
                     <m:r>
                       <m:t>3</m:t>
                     </m:r>
+                  </m:sup>
+                </m:sSubSup>
+                <m:r>
+                  <m:rPr>
+                    <m:sty m:val="p"/>
+                  </m:rPr>
+                  <m:t>=</m:t>
+                </m:r>
+                <m:f>
+                  <m:fPr>
+                    <m:type m:val="bar"/>
+                  </m:fPr>
+                  <m:num>
                     <m:r>
-                      <m:rPr>
-                        <m:sty m:val="p"/>
-                      </m:rPr>
-                      <m:t>×</m:t>
+                      <m:t>1</m:t>
                     </m:r>
+                  </m:num>
+                  <m:den>
                     <m:r>
                       <m:t>3</m:t>
                     </m:r>
-                  </m:oMath>
-                  <w:r>
-                    <w:rPr>
-                      <w:rtl/>
-                    </w:rPr>
-                    <w:t xml:space="preserve">.</w:t>
-                  </w:r>
-                </w:p>
-              </w:tc>
-            </w:tr>
-          </w:tbl>
+                  </m:den>
+                </m:f>
+                <m:r>
+                  <m:rPr>
+                    <m:sty m:val="p"/>
+                  </m:rPr>
+                  <m:t>×</m:t>
+                </m:r>
+                <m:r>
+                  <m:t>9</m:t>
+                </m:r>
+                <m:r>
+                  <m:rPr>
+                    <m:sty m:val="p"/>
+                  </m:rPr>
+                  <m:t>=</m:t>
+                </m:r>
+                <m:borderBox>
+                  <m:e>
+                    <m:r>
+                      <m:t>3</m:t>
+                    </m:r>
+                  </m:e>
+                </m:borderBox>
+              </m:oMath>
+            </m:oMathPara>
+          </w:p>
           <w:p>
             <w:pPr>
               <w:bidi/>
-              <w:spacing w:before="0" w:after="0"/>
             </w:pPr>
+            <w:r>
+              <w:rPr>
+                <w:rtl/>
+              </w:rPr>
+              <w:t xml:space="preserve">المساحة تحت المنحني (</w:t>
+            </w:r>
+            <m:oMath>
+              <m:r>
+                <m:t>9</m:t>
+              </m:r>
+              <m:r>
+                <m:t> </m:t>
+              </m:r>
+              <m:r>
+                <m:rPr>
+                  <m:sty m:val="p"/>
+                </m:rPr>
+                <m:t>u</m:t>
+              </m:r>
+              <m:r>
+                <m:rPr>
+                  <m:sty m:val="p"/>
+                </m:rPr>
+                <m:t>.</m:t>
+              </m:r>
+              <m:r>
+                <m:rPr>
+                  <m:sty m:val="p"/>
+                </m:rPr>
+                <m:t>a</m:t>
+              </m:r>
+            </m:oMath>
+            <w:r>
+              <w:rPr>
+                <w:rtl/>
+              </w:rPr>
+              <w:t xml:space="preserve">) تساوي مساحة المستطيل</w:t>
+            </w:r>
+            <w:r>
+              <w:rPr>
+                <w:rtl/>
+              </w:rPr>
+              <w:t xml:space="preserve"> </w:t>
+            </w:r>
+            <m:oMath>
+              <m:r>
+                <m:t>3</m:t>
+              </m:r>
+              <m:r>
+                <m:rPr>
+                  <m:sty m:val="p"/>
+                </m:rPr>
+                <m:t>×</m:t>
+              </m:r>
+              <m:r>
+                <m:t>3</m:t>
+              </m:r>
+            </m:oMath>
+            <w:r>
+              <w:rPr>
+                <w:rtl/>
+              </w:rPr>
+              <w:t xml:space="preserve">.</w:t>
+            </w:r>
           </w:p>
         </w:tc>
       </w:tr>
     </w:tbl>
+    <w:p>
+      <w:pPr>
+        <w:bidi/>
+        <w:spacing w:before="0" w:after="0"/>
+      </w:pPr>
+    </w:p>
+    <w:p>
+      <w:pPr>
+        <w:bidi/>
+        <w:jc w:val="center"/>
+      </w:pPr>
+      <w:r>
+        <w:rPr>
+          <w:rtl/>
+        </w:rPr>
+        <w:drawing>
+          <wp:inline>
+            <wp:extent cx="1732788" cy="1664208"/>
+            <wp:docPr id="3" name="Picture 3"/>
+            <wp:cNvGraphicFramePr>
+              <a:graphicFrameLocks noChangeAspect="1"/>
+            </wp:cNvGraphicFramePr>
+            <a:graphic>
+              <a:graphicData uri="http://schemas.openxmlformats.org/drawingml/2006/picture">
+                <pic:pic>
+                  <pic:nvPicPr>
+                    <pic:cNvPr id="0" name="d453c6b4b463d8e4.png"/>
+                    <pic:cNvPicPr/>
+                  </pic:nvPicPr>
+                  <pic:blipFill>
+                    <a:blip r:embed="rId11"/>
+                    <a:stretch>
+                      <a:fillRect/>
+                    </a:stretch>
+                  </pic:blipFill>
+                  <pic:spPr>
+                    <a:xfrm>
+                      <a:off x="0" y="0"/>
+                      <a:ext cx="1732788" cy="1664208"/>
+                    </a:xfrm>
+                    <a:prstGeom prst="rect"/>
+                  </pic:spPr>
+                </pic:pic>
+              </a:graphicData>
+            </a:graphic>
+          </wp:inline>
+        </w:drawing>
+      </w:r>
+    </w:p>
     <w:tbl>
       <w:tblPr>
         <w:tblW w:w="9864" w:type="dxa"/>

</xml_diff>

<commit_message>
Integrals (3AS): summary, exercises and bac exercises with relative-position tables in the teacher's model (auto-converted)
Co-Authored-By: Claude Opus 5.5 <noreply@anthropic.com>
Claude-Session: https://claude.ai/code/session_015WVgZKTbSWpZTjn6aZsqC9
</commit_message>
<xml_diff>
--- a/documents/integrales/molakhas_integ_3as.docx
+++ b/documents/integrales/molakhas_integ_3as.docx
@@ -2858,6 +2858,9 @@
               <m:borderBox>
                 <m:e>
                   <m:r>
+                    <w:rPr>
+                      <w:highlight w:val="yellow"/>
+                    </w:rPr>
                     <m:t>F</m:t>
                   </m:r>
                   <m:d>
@@ -2869,6 +2872,9 @@
                     </m:dPr>
                     <m:e>
                       <m:r>
+                        <w:rPr>
+                          <w:highlight w:val="yellow"/>
+                        </w:rPr>
                         <m:t>x</m:t>
                       </m:r>
                     </m:e>
@@ -2877,16 +2883,25 @@
                     <m:rPr>
                       <m:sty m:val="p"/>
                     </m:rPr>
+                    <w:rPr>
+                      <w:highlight w:val="yellow"/>
+                    </w:rPr>
                     <m:t>=</m:t>
                   </m:r>
                   <m:sSup>
                     <m:e>
                       <m:r>
+                        <w:rPr>
+                          <w:highlight w:val="yellow"/>
+                        </w:rPr>
                         <m:t>x</m:t>
                       </m:r>
                     </m:e>
                     <m:sup>
                       <m:r>
+                        <w:rPr>
+                          <w:highlight w:val="yellow"/>
+                        </w:rPr>
                         <m:t>3</m:t>
                       </m:r>
                     </m:sup>
@@ -2895,19 +2910,31 @@
                     <m:rPr>
                       <m:sty m:val="p"/>
                     </m:rPr>
+                    <w:rPr>
+                      <w:highlight w:val="yellow"/>
+                    </w:rPr>
                     <m:t>+</m:t>
                   </m:r>
                   <m:r>
+                    <w:rPr>
+                      <w:highlight w:val="yellow"/>
+                    </w:rPr>
                     <m:t>2</m:t>
                   </m:r>
                   <m:sSup>
                     <m:e>
                       <m:r>
+                        <w:rPr>
+                          <w:highlight w:val="yellow"/>
+                        </w:rPr>
                         <m:t>x</m:t>
                       </m:r>
                     </m:e>
                     <m:sup>
                       <m:r>
+                        <w:rPr>
+                          <w:highlight w:val="yellow"/>
+                        </w:rPr>
                         <m:t>2</m:t>
                       </m:r>
                     </m:sup>
@@ -2916,21 +2943,36 @@
                     <m:rPr>
                       <m:sty m:val="p"/>
                     </m:rPr>
+                    <w:rPr>
+                      <w:highlight w:val="yellow"/>
+                    </w:rPr>
                     <m:t>−</m:t>
                   </m:r>
                   <m:r>
+                    <w:rPr>
+                      <w:highlight w:val="yellow"/>
+                    </w:rPr>
                     <m:t>2</m:t>
                   </m:r>
                   <m:r>
+                    <w:rPr>
+                      <w:highlight w:val="yellow"/>
+                    </w:rPr>
                     <m:t>x</m:t>
                   </m:r>
                   <m:r>
                     <m:rPr>
                       <m:sty m:val="p"/>
                     </m:rPr>
+                    <w:rPr>
+                      <w:highlight w:val="yellow"/>
+                    </w:rPr>
                     <m:t>+</m:t>
                   </m:r>
                   <m:r>
+                    <w:rPr>
+                      <w:highlight w:val="yellow"/>
+                    </w:rPr>
                     <m:t>3</m:t>
                   </m:r>
                 </m:e>
@@ -6941,6 +6983,9 @@
                 <m:borderBox>
                   <m:e>
                     <m:r>
+                      <w:rPr>
+                        <w:highlight w:val="yellow"/>
+                      </w:rPr>
                       <m:t>F</m:t>
                     </m:r>
                     <m:d>
@@ -6952,6 +6997,9 @@
                       </m:dPr>
                       <m:e>
                         <m:r>
+                          <w:rPr>
+                            <w:highlight w:val="yellow"/>
+                          </w:rPr>
                           <m:t>x</m:t>
                         </m:r>
                       </m:e>
@@ -6960,6 +7008,9 @@
                       <m:rPr>
                         <m:sty m:val="p"/>
                       </m:rPr>
+                      <w:rPr>
+                        <w:highlight w:val="yellow"/>
+                      </w:rPr>
                       <m:t>=</m:t>
                     </m:r>
                     <m:f>
@@ -6968,11 +7019,17 @@
                       </m:fPr>
                       <m:num>
                         <m:r>
+                          <w:rPr>
+                            <w:highlight w:val="yellow"/>
+                          </w:rPr>
                           <m:t>1</m:t>
                         </m:r>
                       </m:num>
                       <m:den>
                         <m:r>
+                          <w:rPr>
+                            <w:highlight w:val="yellow"/>
+                          </w:rPr>
                           <m:t>3</m:t>
                         </m:r>
                       </m:den>
@@ -6990,11 +7047,17 @@
                             <m:sSup>
                               <m:e>
                                 <m:r>
+                                  <w:rPr>
+                                    <w:highlight w:val="yellow"/>
+                                  </w:rPr>
                                   <m:t>x</m:t>
                                 </m:r>
                               </m:e>
                               <m:sup>
                                 <m:r>
+                                  <w:rPr>
+                                    <w:highlight w:val="yellow"/>
+                                  </w:rPr>
                                   <m:t>3</m:t>
                                 </m:r>
                               </m:sup>
@@ -7003,16 +7066,25 @@
                               <m:rPr>
                                 <m:sty m:val="p"/>
                               </m:rPr>
+                              <w:rPr>
+                                <w:highlight w:val="yellow"/>
+                              </w:rPr>
                               <m:t>+</m:t>
                             </m:r>
                             <m:sSup>
                               <m:e>
                                 <m:r>
+                                  <w:rPr>
+                                    <w:highlight w:val="yellow"/>
+                                  </w:rPr>
                                   <m:t>x</m:t>
                                 </m:r>
                               </m:e>
                               <m:sup>
                                 <m:r>
+                                  <w:rPr>
+                                    <w:highlight w:val="yellow"/>
+                                  </w:rPr>
                                   <m:t>2</m:t>
                                 </m:r>
                               </m:sup>
@@ -7021,9 +7093,15 @@
                               <m:rPr>
                                 <m:sty m:val="p"/>
                               </m:rPr>
+                              <w:rPr>
+                                <w:highlight w:val="yellow"/>
+                              </w:rPr>
                               <m:t>+</m:t>
                             </m:r>
                             <m:r>
+                              <w:rPr>
+                                <w:highlight w:val="yellow"/>
+                              </w:rPr>
                               <m:t>7</m:t>
                             </m:r>
                           </m:e>
@@ -7031,6 +7109,9 @@
                       </m:e>
                       <m:sup>
                         <m:r>
+                          <w:rPr>
+                            <w:highlight w:val="yellow"/>
+                          </w:rPr>
                           <m:t>3</m:t>
                         </m:r>
                       </m:sup>
@@ -7039,9 +7120,15 @@
                       <m:rPr>
                         <m:sty m:val="p"/>
                       </m:rPr>
+                      <w:rPr>
+                        <w:highlight w:val="yellow"/>
+                      </w:rPr>
                       <m:t>+</m:t>
                     </m:r>
                     <m:r>
+                      <w:rPr>
+                        <w:highlight w:val="yellow"/>
+                      </w:rPr>
                       <m:t>c</m:t>
                     </m:r>
                   </m:e>
@@ -7423,6 +7510,9 @@
                 <m:borderBox>
                   <m:e>
                     <m:r>
+                      <w:rPr>
+                        <w:highlight w:val="yellow"/>
+                      </w:rPr>
                       <m:t>F</m:t>
                     </m:r>
                     <m:d>
@@ -7434,6 +7524,9 @@
                       </m:dPr>
                       <m:e>
                         <m:r>
+                          <w:rPr>
+                            <w:highlight w:val="yellow"/>
+                          </w:rPr>
                           <m:t>x</m:t>
                         </m:r>
                       </m:e>
@@ -7442,6 +7535,9 @@
                       <m:rPr>
                         <m:sty m:val="p"/>
                       </m:rPr>
+                      <w:rPr>
+                        <w:highlight w:val="yellow"/>
+                      </w:rPr>
                       <m:t>=</m:t>
                     </m:r>
                     <m:f>
@@ -7450,11 +7546,17 @@
                       </m:fPr>
                       <m:num>
                         <m:r>
+                          <w:rPr>
+                            <w:highlight w:val="yellow"/>
+                          </w:rPr>
                           <m:t>1</m:t>
                         </m:r>
                       </m:num>
                       <m:den>
                         <m:r>
+                          <w:rPr>
+                            <w:highlight w:val="yellow"/>
+                          </w:rPr>
                           <m:t>12</m:t>
                         </m:r>
                       </m:den>
@@ -7470,16 +7572,25 @@
                           </m:dPr>
                           <m:e>
                             <m:r>
+                              <w:rPr>
+                                <w:highlight w:val="yellow"/>
+                              </w:rPr>
                               <m:t>2</m:t>
                             </m:r>
                             <m:sSup>
                               <m:e>
                                 <m:r>
+                                  <w:rPr>
+                                    <w:highlight w:val="yellow"/>
+                                  </w:rPr>
                                   <m:t>x</m:t>
                                 </m:r>
                               </m:e>
                               <m:sup>
                                 <m:r>
+                                  <w:rPr>
+                                    <w:highlight w:val="yellow"/>
+                                  </w:rPr>
                                   <m:t>2</m:t>
                                 </m:r>
                               </m:sup>
@@ -7488,21 +7599,36 @@
                               <m:rPr>
                                 <m:sty m:val="p"/>
                               </m:rPr>
+                              <w:rPr>
+                                <w:highlight w:val="yellow"/>
+                              </w:rPr>
                               <m:t>+</m:t>
                             </m:r>
                             <m:r>
+                              <w:rPr>
+                                <w:highlight w:val="yellow"/>
+                              </w:rPr>
                               <m:t>4</m:t>
                             </m:r>
                             <m:r>
+                              <w:rPr>
+                                <w:highlight w:val="yellow"/>
+                              </w:rPr>
                               <m:t>x</m:t>
                             </m:r>
                             <m:r>
                               <m:rPr>
                                 <m:sty m:val="p"/>
                               </m:rPr>
+                              <w:rPr>
+                                <w:highlight w:val="yellow"/>
+                              </w:rPr>
                               <m:t>+</m:t>
                             </m:r>
                             <m:r>
+                              <w:rPr>
+                                <w:highlight w:val="yellow"/>
+                              </w:rPr>
                               <m:t>1</m:t>
                             </m:r>
                           </m:e>
@@ -7510,6 +7636,9 @@
                       </m:e>
                       <m:sup>
                         <m:r>
+                          <w:rPr>
+                            <w:highlight w:val="yellow"/>
+                          </w:rPr>
                           <m:t>3</m:t>
                         </m:r>
                       </m:sup>
@@ -7518,9 +7647,15 @@
                       <m:rPr>
                         <m:sty m:val="p"/>
                       </m:rPr>
+                      <w:rPr>
+                        <w:highlight w:val="yellow"/>
+                      </w:rPr>
                       <m:t>+</m:t>
                     </m:r>
                     <m:r>
+                      <w:rPr>
+                        <w:highlight w:val="yellow"/>
+                      </w:rPr>
                       <m:t>c</m:t>
                     </m:r>
                   </m:e>
@@ -7765,6 +7900,9 @@
               <m:borderBox>
                 <m:e>
                   <m:r>
+                    <w:rPr>
+                      <w:highlight w:val="yellow"/>
+                    </w:rPr>
                     <m:t>G</m:t>
                   </m:r>
                   <m:d>
@@ -7776,6 +7914,9 @@
                     </m:dPr>
                     <m:e>
                       <m:r>
+                        <w:rPr>
+                          <w:highlight w:val="yellow"/>
+                        </w:rPr>
                         <m:t>x</m:t>
                       </m:r>
                     </m:e>
@@ -7784,12 +7925,18 @@
                     <m:rPr>
                       <m:sty m:val="p"/>
                     </m:rPr>
+                    <w:rPr>
+                      <w:highlight w:val="yellow"/>
+                    </w:rPr>
                     <m:t>=</m:t>
                   </m:r>
                   <m:r>
                     <m:rPr>
                       <m:sty m:val="p"/>
                     </m:rPr>
+                    <w:rPr>
+                      <w:highlight w:val="yellow"/>
+                    </w:rPr>
                     <m:t>−</m:t>
                   </m:r>
                   <m:f>
@@ -7798,6 +7945,9 @@
                     </m:fPr>
                     <m:num>
                       <m:r>
+                        <w:rPr>
+                          <w:highlight w:val="yellow"/>
+                        </w:rPr>
                         <m:t>1</m:t>
                       </m:r>
                     </m:num>
@@ -7805,11 +7955,17 @@
                       <m:sSup>
                         <m:e>
                           <m:r>
+                            <w:rPr>
+                              <w:highlight w:val="yellow"/>
+                            </w:rPr>
                             <m:t>x</m:t>
                           </m:r>
                         </m:e>
                         <m:sup>
                           <m:r>
+                            <w:rPr>
+                              <w:highlight w:val="yellow"/>
+                            </w:rPr>
                             <m:t>2</m:t>
                           </m:r>
                         </m:sup>
@@ -7818,9 +7974,15 @@
                         <m:rPr>
                           <m:sty m:val="p"/>
                         </m:rPr>
+                        <w:rPr>
+                          <w:highlight w:val="yellow"/>
+                        </w:rPr>
                         <m:t>+</m:t>
                       </m:r>
                       <m:r>
+                        <w:rPr>
+                          <w:highlight w:val="yellow"/>
+                        </w:rPr>
                         <m:t>1</m:t>
                       </m:r>
                     </m:den>
@@ -7829,9 +7991,15 @@
                     <m:rPr>
                       <m:sty m:val="p"/>
                     </m:rPr>
+                    <w:rPr>
+                      <w:highlight w:val="yellow"/>
+                    </w:rPr>
                     <m:t>+</m:t>
                   </m:r>
                   <m:r>
+                    <w:rPr>
+                      <w:highlight w:val="yellow"/>
+                    </w:rPr>
                     <m:t>c</m:t>
                   </m:r>
                 </m:e>
@@ -8217,6 +8385,9 @@
                 <m:borderBox>
                   <m:e>
                     <m:r>
+                      <w:rPr>
+                        <w:highlight w:val="yellow"/>
+                      </w:rPr>
                       <m:t>H</m:t>
                     </m:r>
                     <m:d>
@@ -8228,6 +8399,9 @@
                       </m:dPr>
                       <m:e>
                         <m:r>
+                          <w:rPr>
+                            <w:highlight w:val="yellow"/>
+                          </w:rPr>
                           <m:t>x</m:t>
                         </m:r>
                       </m:e>
@@ -8236,6 +8410,9 @@
                       <m:rPr>
                         <m:sty m:val="p"/>
                       </m:rPr>
+                      <w:rPr>
+                        <w:highlight w:val="yellow"/>
+                      </w:rPr>
                       <m:t>=</m:t>
                     </m:r>
                     <m:f>
@@ -8244,11 +8421,17 @@
                       </m:fPr>
                       <m:num>
                         <m:r>
+                          <w:rPr>
+                            <w:highlight w:val="yellow"/>
+                          </w:rPr>
                           <m:t>1</m:t>
                         </m:r>
                       </m:num>
                       <m:den>
                         <m:r>
+                          <w:rPr>
+                            <w:highlight w:val="yellow"/>
+                          </w:rPr>
                           <m:t>2</m:t>
                         </m:r>
                       </m:den>
@@ -8257,6 +8440,9 @@
                       <m:rPr>
                         <m:sty m:val="p"/>
                       </m:rPr>
+                      <w:rPr>
+                        <w:highlight w:val="yellow"/>
+                      </w:rPr>
                       <m:t>×</m:t>
                     </m:r>
                     <m:f>
@@ -8268,24 +8454,39 @@
                           <m:rPr>
                             <m:sty m:val="p"/>
                           </m:rPr>
+                          <w:rPr>
+                            <w:highlight w:val="yellow"/>
+                          </w:rPr>
                           <m:t>−</m:t>
                         </m:r>
                         <m:r>
+                          <w:rPr>
+                            <w:highlight w:val="yellow"/>
+                          </w:rPr>
                           <m:t>1</m:t>
                         </m:r>
                       </m:num>
                       <m:den>
                         <m:r>
+                          <w:rPr>
+                            <w:highlight w:val="yellow"/>
+                          </w:rPr>
                           <m:t>2</m:t>
                         </m:r>
                         <m:sSup>
                           <m:e>
                             <m:r>
+                              <w:rPr>
+                                <w:highlight w:val="yellow"/>
+                              </w:rPr>
                               <m:t>u</m:t>
                             </m:r>
                           </m:e>
                           <m:sup>
                             <m:r>
+                              <w:rPr>
+                                <w:highlight w:val="yellow"/>
+                              </w:rPr>
                               <m:t>2</m:t>
                             </m:r>
                           </m:sup>
@@ -8296,21 +8497,33 @@
                       <m:rPr>
                         <m:sty m:val="p"/>
                       </m:rPr>
+                      <w:rPr>
+                        <w:highlight w:val="yellow"/>
+                      </w:rPr>
                       <m:t>+</m:t>
                     </m:r>
                     <m:r>
+                      <w:rPr>
+                        <w:highlight w:val="yellow"/>
+                      </w:rPr>
                       <m:t>c</m:t>
                     </m:r>
                     <m:r>
                       <m:rPr>
                         <m:sty m:val="p"/>
                       </m:rPr>
+                      <w:rPr>
+                        <w:highlight w:val="yellow"/>
+                      </w:rPr>
                       <m:t>=</m:t>
                     </m:r>
                     <m:r>
                       <m:rPr>
                         <m:sty m:val="p"/>
                       </m:rPr>
+                      <w:rPr>
+                        <w:highlight w:val="yellow"/>
+                      </w:rPr>
                       <m:t>−</m:t>
                     </m:r>
                     <m:f>
@@ -8319,11 +8532,17 @@
                       </m:fPr>
                       <m:num>
                         <m:r>
+                          <w:rPr>
+                            <w:highlight w:val="yellow"/>
+                          </w:rPr>
                           <m:t>1</m:t>
                         </m:r>
                       </m:num>
                       <m:den>
                         <m:r>
+                          <w:rPr>
+                            <w:highlight w:val="yellow"/>
+                          </w:rPr>
                           <m:t>4</m:t>
                         </m:r>
                         <m:sSup>
@@ -8337,16 +8556,25 @@
                               </m:dPr>
                               <m:e>
                                 <m:r>
+                                  <w:rPr>
+                                    <w:highlight w:val="yellow"/>
+                                  </w:rPr>
                                   <m:t>3</m:t>
                                 </m:r>
                                 <m:sSup>
                                   <m:e>
                                     <m:r>
+                                      <w:rPr>
+                                        <w:highlight w:val="yellow"/>
+                                      </w:rPr>
                                       <m:t>x</m:t>
                                     </m:r>
                                   </m:e>
                                   <m:sup>
                                     <m:r>
+                                      <w:rPr>
+                                        <w:highlight w:val="yellow"/>
+                                      </w:rPr>
                                       <m:t>2</m:t>
                                     </m:r>
                                   </m:sup>
@@ -8355,21 +8583,36 @@
                                   <m:rPr>
                                     <m:sty m:val="p"/>
                                   </m:rPr>
+                                  <w:rPr>
+                                    <w:highlight w:val="yellow"/>
+                                  </w:rPr>
                                   <m:t>+</m:t>
                                 </m:r>
                                 <m:r>
+                                  <w:rPr>
+                                    <w:highlight w:val="yellow"/>
+                                  </w:rPr>
                                   <m:t>2</m:t>
                                 </m:r>
                                 <m:r>
+                                  <w:rPr>
+                                    <w:highlight w:val="yellow"/>
+                                  </w:rPr>
                                   <m:t>x</m:t>
                                 </m:r>
                                 <m:r>
                                   <m:rPr>
                                     <m:sty m:val="p"/>
                                   </m:rPr>
+                                  <w:rPr>
+                                    <w:highlight w:val="yellow"/>
+                                  </w:rPr>
                                   <m:t>+</m:t>
                                 </m:r>
                                 <m:r>
+                                  <w:rPr>
+                                    <w:highlight w:val="yellow"/>
+                                  </w:rPr>
                                   <m:t>7</m:t>
                                 </m:r>
                               </m:e>
@@ -8377,6 +8620,9 @@
                           </m:e>
                           <m:sup>
                             <m:r>
+                              <w:rPr>
+                                <w:highlight w:val="yellow"/>
+                              </w:rPr>
                               <m:t>2</m:t>
                             </m:r>
                           </m:sup>
@@ -8387,9 +8633,15 @@
                       <m:rPr>
                         <m:sty m:val="p"/>
                       </m:rPr>
+                      <w:rPr>
+                        <w:highlight w:val="yellow"/>
+                      </w:rPr>
                       <m:t>+</m:t>
                     </m:r>
                     <m:r>
+                      <w:rPr>
+                        <w:highlight w:val="yellow"/>
+                      </w:rPr>
                       <m:t>c</m:t>
                     </m:r>
                   </m:e>
@@ -8660,6 +8912,9 @@
               <m:borderBox>
                 <m:e>
                   <m:r>
+                    <w:rPr>
+                      <w:highlight w:val="yellow"/>
+                    </w:rPr>
                     <m:t>V</m:t>
                   </m:r>
                   <m:d>
@@ -8671,6 +8926,9 @@
                     </m:dPr>
                     <m:e>
                       <m:r>
+                        <w:rPr>
+                          <w:highlight w:val="yellow"/>
+                        </w:rPr>
                         <m:t>x</m:t>
                       </m:r>
                     </m:e>
@@ -8679,9 +8937,15 @@
                     <m:rPr>
                       <m:sty m:val="p"/>
                     </m:rPr>
+                    <w:rPr>
+                      <w:highlight w:val="yellow"/>
+                    </w:rPr>
                     <m:t>=</m:t>
                   </m:r>
                   <m:r>
+                    <w:rPr>
+                      <w:highlight w:val="yellow"/>
+                    </w:rPr>
                     <m:t>5</m:t>
                   </m:r>
                   <m:rad>
@@ -8693,11 +8957,17 @@
                       <m:sSup>
                         <m:e>
                           <m:r>
+                            <w:rPr>
+                              <w:highlight w:val="yellow"/>
+                            </w:rPr>
                             <m:t>x</m:t>
                           </m:r>
                         </m:e>
                         <m:sup>
                           <m:r>
+                            <w:rPr>
+                              <w:highlight w:val="yellow"/>
+                            </w:rPr>
                             <m:t>2</m:t>
                           </m:r>
                         </m:sup>
@@ -8706,9 +8976,15 @@
                         <m:rPr>
                           <m:sty m:val="p"/>
                         </m:rPr>
+                        <w:rPr>
+                          <w:highlight w:val="yellow"/>
+                        </w:rPr>
                         <m:t>+</m:t>
                       </m:r>
                       <m:r>
+                        <w:rPr>
+                          <w:highlight w:val="yellow"/>
+                        </w:rPr>
                         <m:t>1</m:t>
                       </m:r>
                     </m:e>
@@ -8717,9 +8993,15 @@
                     <m:rPr>
                       <m:sty m:val="p"/>
                     </m:rPr>
+                    <w:rPr>
+                      <w:highlight w:val="yellow"/>
+                    </w:rPr>
                     <m:t>+</m:t>
                   </m:r>
                   <m:r>
+                    <w:rPr>
+                      <w:highlight w:val="yellow"/>
+                    </w:rPr>
                     <m:t>c</m:t>
                   </m:r>
                 </m:e>
@@ -9079,6 +9361,9 @@
               <m:borderBox>
                 <m:e>
                   <m:r>
+                    <w:rPr>
+                      <w:highlight w:val="yellow"/>
+                    </w:rPr>
                     <m:t>F</m:t>
                   </m:r>
                   <m:d>
@@ -9090,6 +9375,9 @@
                     </m:dPr>
                     <m:e>
                       <m:r>
+                        <w:rPr>
+                          <w:highlight w:val="yellow"/>
+                        </w:rPr>
                         <m:t>x</m:t>
                       </m:r>
                     </m:e>
@@ -9098,12 +9386,18 @@
                     <m:rPr>
                       <m:sty m:val="p"/>
                     </m:rPr>
+                    <w:rPr>
+                      <w:highlight w:val="yellow"/>
+                    </w:rPr>
                     <m:t>=</m:t>
                   </m:r>
                   <m:r>
                     <m:rPr>
                       <m:sty m:val="p"/>
                     </m:rPr>
+                    <w:rPr>
+                      <w:highlight w:val="yellow"/>
+                    </w:rPr>
                     <m:t>ln</m:t>
                   </m:r>
                   <m:d>
@@ -9115,15 +9409,24 @@
                     </m:dPr>
                     <m:e>
                       <m:r>
+                        <w:rPr>
+                          <w:highlight w:val="yellow"/>
+                        </w:rPr>
                         <m:t>x</m:t>
                       </m:r>
                       <m:r>
                         <m:rPr>
                           <m:sty m:val="p"/>
                         </m:rPr>
+                        <w:rPr>
+                          <w:highlight w:val="yellow"/>
+                        </w:rPr>
                         <m:t>+</m:t>
                       </m:r>
                       <m:r>
+                        <w:rPr>
+                          <w:highlight w:val="yellow"/>
+                        </w:rPr>
                         <m:t>1</m:t>
                       </m:r>
                     </m:e>
@@ -9132,9 +9435,15 @@
                     <m:rPr>
                       <m:sty m:val="p"/>
                     </m:rPr>
+                    <w:rPr>
+                      <w:highlight w:val="yellow"/>
+                    </w:rPr>
                     <m:t>+</m:t>
                   </m:r>
                   <m:r>
+                    <w:rPr>
+                      <w:highlight w:val="yellow"/>
+                    </w:rPr>
                     <m:t>c</m:t>
                   </m:r>
                 </m:e>
@@ -9298,6 +9607,9 @@
               <m:borderBox>
                 <m:e>
                   <m:r>
+                    <w:rPr>
+                      <w:highlight w:val="yellow"/>
+                    </w:rPr>
                     <m:t>F</m:t>
                   </m:r>
                   <m:d>
@@ -9309,6 +9621,9 @@
                     </m:dPr>
                     <m:e>
                       <m:r>
+                        <w:rPr>
+                          <w:highlight w:val="yellow"/>
+                        </w:rPr>
                         <m:t>x</m:t>
                       </m:r>
                     </m:e>
@@ -9317,12 +9632,18 @@
                     <m:rPr>
                       <m:sty m:val="p"/>
                     </m:rPr>
+                    <w:rPr>
+                      <w:highlight w:val="yellow"/>
+                    </w:rPr>
                     <m:t>=</m:t>
                   </m:r>
                   <m:r>
                     <m:rPr>
                       <m:sty m:val="p"/>
                     </m:rPr>
+                    <w:rPr>
+                      <w:highlight w:val="yellow"/>
+                    </w:rPr>
                     <m:t>ln</m:t>
                   </m:r>
                   <m:d>
@@ -9337,9 +9658,15 @@
                         <m:rPr>
                           <m:sty m:val="p"/>
                         </m:rPr>
+                        <w:rPr>
+                          <w:highlight w:val="yellow"/>
+                        </w:rPr>
                         <m:t>sin</m:t>
                       </m:r>
                       <m:r>
+                        <w:rPr>
+                          <w:highlight w:val="yellow"/>
+                        </w:rPr>
                         <m:t>x</m:t>
                       </m:r>
                     </m:e>
@@ -9348,9 +9675,15 @@
                     <m:rPr>
                       <m:sty m:val="p"/>
                     </m:rPr>
+                    <w:rPr>
+                      <w:highlight w:val="yellow"/>
+                    </w:rPr>
                     <m:t>+</m:t>
                   </m:r>
                   <m:r>
+                    <w:rPr>
+                      <w:highlight w:val="yellow"/>
+                    </w:rPr>
                     <m:t>c</m:t>
                   </m:r>
                 </m:e>
@@ -9577,6 +9910,9 @@
               <m:borderBox>
                 <m:e>
                   <m:r>
+                    <w:rPr>
+                      <w:highlight w:val="yellow"/>
+                    </w:rPr>
                     <m:t>F</m:t>
                   </m:r>
                   <m:d>
@@ -9588,6 +9924,9 @@
                     </m:dPr>
                     <m:e>
                       <m:r>
+                        <w:rPr>
+                          <w:highlight w:val="yellow"/>
+                        </w:rPr>
                         <m:t>x</m:t>
                       </m:r>
                     </m:e>
@@ -9596,6 +9935,9 @@
                     <m:rPr>
                       <m:sty m:val="p"/>
                     </m:rPr>
+                    <w:rPr>
+                      <w:highlight w:val="yellow"/>
+                    </w:rPr>
                     <m:t>=</m:t>
                   </m:r>
                   <m:f>
@@ -9604,11 +9946,17 @@
                     </m:fPr>
                     <m:num>
                       <m:r>
+                        <w:rPr>
+                          <w:highlight w:val="yellow"/>
+                        </w:rPr>
                         <m:t>1</m:t>
                       </m:r>
                     </m:num>
                     <m:den>
                       <m:r>
+                        <w:rPr>
+                          <w:highlight w:val="yellow"/>
+                        </w:rPr>
                         <m:t>2</m:t>
                       </m:r>
                     </m:den>
@@ -9617,6 +9965,9 @@
                     <m:rPr>
                       <m:sty m:val="p"/>
                     </m:rPr>
+                    <w:rPr>
+                      <w:highlight w:val="yellow"/>
+                    </w:rPr>
                     <m:t>ln</m:t>
                   </m:r>
                   <m:d>
@@ -9630,11 +9981,17 @@
                       <m:sSup>
                         <m:e>
                           <m:r>
+                            <w:rPr>
+                              <w:highlight w:val="yellow"/>
+                            </w:rPr>
                             <m:t>x</m:t>
                           </m:r>
                         </m:e>
                         <m:sup>
                           <m:r>
+                            <w:rPr>
+                              <w:highlight w:val="yellow"/>
+                            </w:rPr>
                             <m:t>2</m:t>
                           </m:r>
                         </m:sup>
@@ -9643,9 +10000,15 @@
                         <m:rPr>
                           <m:sty m:val="p"/>
                         </m:rPr>
+                        <w:rPr>
+                          <w:highlight w:val="yellow"/>
+                        </w:rPr>
                         <m:t>−</m:t>
                       </m:r>
                       <m:r>
+                        <w:rPr>
+                          <w:highlight w:val="yellow"/>
+                        </w:rPr>
                         <m:t>1</m:t>
                       </m:r>
                     </m:e>
@@ -9654,9 +10017,15 @@
                     <m:rPr>
                       <m:sty m:val="p"/>
                     </m:rPr>
+                    <w:rPr>
+                      <w:highlight w:val="yellow"/>
+                    </w:rPr>
                     <m:t>+</m:t>
                   </m:r>
                   <m:r>
+                    <w:rPr>
+                      <w:highlight w:val="yellow"/>
+                    </w:rPr>
                     <m:t>c</m:t>
                   </m:r>
                 </m:e>
@@ -9786,6 +10155,9 @@
               <m:borderBox>
                 <m:e>
                   <m:r>
+                    <w:rPr>
+                      <w:highlight w:val="yellow"/>
+                    </w:rPr>
                     <m:t>F</m:t>
                   </m:r>
                   <m:d>
@@ -9797,6 +10169,9 @@
                     </m:dPr>
                     <m:e>
                       <m:r>
+                        <w:rPr>
+                          <w:highlight w:val="yellow"/>
+                        </w:rPr>
                         <m:t>x</m:t>
                       </m:r>
                     </m:e>
@@ -9805,12 +10180,18 @@
                     <m:rPr>
                       <m:sty m:val="p"/>
                     </m:rPr>
+                    <w:rPr>
+                      <w:highlight w:val="yellow"/>
+                    </w:rPr>
                     <m:t>=</m:t>
                   </m:r>
                   <m:r>
                     <m:rPr>
                       <m:sty m:val="p"/>
                     </m:rPr>
+                    <w:rPr>
+                      <w:highlight w:val="yellow"/>
+                    </w:rPr>
                     <m:t>ln</m:t>
                   </m:r>
                   <m:d>
@@ -9824,11 +10205,17 @@
                       <m:sSup>
                         <m:e>
                           <m:r>
+                            <w:rPr>
+                              <w:highlight w:val="yellow"/>
+                            </w:rPr>
                             <m:t>e</m:t>
                           </m:r>
                         </m:e>
                         <m:sup>
                           <m:r>
+                            <w:rPr>
+                              <w:highlight w:val="yellow"/>
+                            </w:rPr>
                             <m:t>x</m:t>
                           </m:r>
                         </m:sup>
@@ -9837,9 +10224,15 @@
                         <m:rPr>
                           <m:sty m:val="p"/>
                         </m:rPr>
+                        <w:rPr>
+                          <w:highlight w:val="yellow"/>
+                        </w:rPr>
                         <m:t>+</m:t>
                       </m:r>
                       <m:r>
+                        <w:rPr>
+                          <w:highlight w:val="yellow"/>
+                        </w:rPr>
                         <m:t>1</m:t>
                       </m:r>
                     </m:e>
@@ -9848,9 +10241,15 @@
                     <m:rPr>
                       <m:sty m:val="p"/>
                     </m:rPr>
+                    <w:rPr>
+                      <w:highlight w:val="yellow"/>
+                    </w:rPr>
                     <m:t>+</m:t>
                   </m:r>
                   <m:r>
+                    <w:rPr>
+                      <w:highlight w:val="yellow"/>
+                    </w:rPr>
                     <m:t>c</m:t>
                   </m:r>
                 </m:e>
@@ -10092,6 +10491,9 @@
               <m:borderBox>
                 <m:e>
                   <m:r>
+                    <w:rPr>
+                      <w:highlight w:val="yellow"/>
+                    </w:rPr>
                     <m:t>F</m:t>
                   </m:r>
                   <m:d>
@@ -10103,6 +10505,9 @@
                     </m:dPr>
                     <m:e>
                       <m:r>
+                        <w:rPr>
+                          <w:highlight w:val="yellow"/>
+                        </w:rPr>
                         <m:t>x</m:t>
                       </m:r>
                     </m:e>
@@ -10111,12 +10516,18 @@
                     <m:rPr>
                       <m:sty m:val="p"/>
                     </m:rPr>
+                    <w:rPr>
+                      <w:highlight w:val="yellow"/>
+                    </w:rPr>
                     <m:t>=</m:t>
                   </m:r>
                   <m:r>
                     <m:rPr>
                       <m:sty m:val="p"/>
                     </m:rPr>
+                    <w:rPr>
+                      <w:highlight w:val="yellow"/>
+                    </w:rPr>
                     <m:t>ln</m:t>
                   </m:r>
                   <m:d>
@@ -10131,9 +10542,15 @@
                         <m:rPr>
                           <m:sty m:val="p"/>
                         </m:rPr>
+                        <w:rPr>
+                          <w:highlight w:val="yellow"/>
+                        </w:rPr>
                         <m:t>ln</m:t>
                       </m:r>
                       <m:r>
+                        <w:rPr>
+                          <w:highlight w:val="yellow"/>
+                        </w:rPr>
                         <m:t>x</m:t>
                       </m:r>
                     </m:e>
@@ -10142,9 +10559,15 @@
                     <m:rPr>
                       <m:sty m:val="p"/>
                     </m:rPr>
+                    <w:rPr>
+                      <w:highlight w:val="yellow"/>
+                    </w:rPr>
                     <m:t>+</m:t>
                   </m:r>
                   <m:r>
+                    <w:rPr>
+                      <w:highlight w:val="yellow"/>
+                    </w:rPr>
                     <m:t>c</m:t>
                   </m:r>
                 </m:e>
@@ -10352,6 +10775,9 @@
               <m:borderBox>
                 <m:e>
                   <m:r>
+                    <w:rPr>
+                      <w:highlight w:val="yellow"/>
+                    </w:rPr>
                     <m:t>F</m:t>
                   </m:r>
                   <m:d>
@@ -10363,6 +10789,9 @@
                     </m:dPr>
                     <m:e>
                       <m:r>
+                        <w:rPr>
+                          <w:highlight w:val="yellow"/>
+                        </w:rPr>
                         <m:t>x</m:t>
                       </m:r>
                     </m:e>
@@ -10371,6 +10800,9 @@
                     <m:rPr>
                       <m:sty m:val="p"/>
                     </m:rPr>
+                    <w:rPr>
+                      <w:highlight w:val="yellow"/>
+                    </w:rPr>
                     <m:t>=</m:t>
                   </m:r>
                   <m:f>
@@ -10379,11 +10811,17 @@
                     </m:fPr>
                     <m:num>
                       <m:r>
+                        <w:rPr>
+                          <w:highlight w:val="yellow"/>
+                        </w:rPr>
                         <m:t>1</m:t>
                       </m:r>
                     </m:num>
                     <m:den>
                       <m:r>
+                        <w:rPr>
+                          <w:highlight w:val="yellow"/>
+                        </w:rPr>
                         <m:t>2</m:t>
                       </m:r>
                     </m:den>
@@ -10402,9 +10840,15 @@
                             <m:rPr>
                               <m:sty m:val="p"/>
                             </m:rPr>
+                            <w:rPr>
+                              <w:highlight w:val="yellow"/>
+                            </w:rPr>
                             <m:t>ln</m:t>
                           </m:r>
                           <m:r>
+                            <w:rPr>
+                              <w:highlight w:val="yellow"/>
+                            </w:rPr>
                             <m:t>x</m:t>
                           </m:r>
                         </m:e>
@@ -10412,6 +10856,9 @@
                     </m:e>
                     <m:sup>
                       <m:r>
+                        <w:rPr>
+                          <w:highlight w:val="yellow"/>
+                        </w:rPr>
                         <m:t>2</m:t>
                       </m:r>
                     </m:sup>
@@ -10420,9 +10867,15 @@
                     <m:rPr>
                       <m:sty m:val="p"/>
                     </m:rPr>
+                    <w:rPr>
+                      <w:highlight w:val="yellow"/>
+                    </w:rPr>
                     <m:t>+</m:t>
                   </m:r>
                   <m:r>
+                    <w:rPr>
+                      <w:highlight w:val="yellow"/>
+                    </w:rPr>
                     <m:t>c</m:t>
                   </m:r>
                 </m:e>
@@ -10546,6 +10999,9 @@
               <m:borderBox>
                 <m:e>
                   <m:r>
+                    <w:rPr>
+                      <w:highlight w:val="yellow"/>
+                    </w:rPr>
                     <m:t>F</m:t>
                   </m:r>
                   <m:d>
@@ -10557,6 +11013,9 @@
                     </m:dPr>
                     <m:e>
                       <m:r>
+                        <w:rPr>
+                          <w:highlight w:val="yellow"/>
+                        </w:rPr>
                         <m:t>x</m:t>
                       </m:r>
                     </m:e>
@@ -10565,11 +11024,17 @@
                     <m:rPr>
                       <m:sty m:val="p"/>
                     </m:rPr>
+                    <w:rPr>
+                      <w:highlight w:val="yellow"/>
+                    </w:rPr>
                     <m:t>=</m:t>
                   </m:r>
                   <m:sSup>
                     <m:e>
                       <m:r>
+                        <w:rPr>
+                          <w:highlight w:val="yellow"/>
+                        </w:rPr>
                         <m:t>e</m:t>
                       </m:r>
                     </m:e>
@@ -10577,11 +11042,17 @@
                       <m:sSup>
                         <m:e>
                           <m:r>
+                            <w:rPr>
+                              <w:highlight w:val="yellow"/>
+                            </w:rPr>
                             <m:t>x</m:t>
                           </m:r>
                         </m:e>
                         <m:sup>
                           <m:r>
+                            <w:rPr>
+                              <w:highlight w:val="yellow"/>
+                            </w:rPr>
                             <m:t>2</m:t>
                           </m:r>
                         </m:sup>
@@ -10590,9 +11061,15 @@
                         <m:rPr>
                           <m:sty m:val="p"/>
                         </m:rPr>
+                        <w:rPr>
+                          <w:highlight w:val="yellow"/>
+                        </w:rPr>
                         <m:t>+</m:t>
                       </m:r>
                       <m:r>
+                        <w:rPr>
+                          <w:highlight w:val="yellow"/>
+                        </w:rPr>
                         <m:t>3</m:t>
                       </m:r>
                     </m:sup>
@@ -10601,9 +11078,15 @@
                     <m:rPr>
                       <m:sty m:val="p"/>
                     </m:rPr>
+                    <w:rPr>
+                      <w:highlight w:val="yellow"/>
+                    </w:rPr>
                     <m:t>+</m:t>
                   </m:r>
                   <m:r>
+                    <w:rPr>
+                      <w:highlight w:val="yellow"/>
+                    </w:rPr>
                     <m:t>c</m:t>
                   </m:r>
                 </m:e>
@@ -10860,6 +11343,9 @@
               <m:borderBox>
                 <m:e>
                   <m:r>
+                    <w:rPr>
+                      <w:highlight w:val="yellow"/>
+                    </w:rPr>
                     <m:t>F</m:t>
                   </m:r>
                   <m:d>
@@ -10871,6 +11357,9 @@
                     </m:dPr>
                     <m:e>
                       <m:r>
+                        <w:rPr>
+                          <w:highlight w:val="yellow"/>
+                        </w:rPr>
                         <m:t>x</m:t>
                       </m:r>
                     </m:e>
@@ -10879,6 +11368,9 @@
                     <m:rPr>
                       <m:sty m:val="p"/>
                     </m:rPr>
+                    <w:rPr>
+                      <w:highlight w:val="yellow"/>
+                    </w:rPr>
                     <m:t>=</m:t>
                   </m:r>
                   <m:f>
@@ -10887,11 +11379,17 @@
                     </m:fPr>
                     <m:num>
                       <m:r>
+                        <w:rPr>
+                          <w:highlight w:val="yellow"/>
+                        </w:rPr>
                         <m:t>1</m:t>
                       </m:r>
                     </m:num>
                     <m:den>
                       <m:r>
+                        <w:rPr>
+                          <w:highlight w:val="yellow"/>
+                        </w:rPr>
                         <m:t>2</m:t>
                       </m:r>
                     </m:den>
@@ -10899,6 +11397,9 @@
                   <m:sSup>
                     <m:e>
                       <m:r>
+                        <w:rPr>
+                          <w:highlight w:val="yellow"/>
+                        </w:rPr>
                         <m:t>e</m:t>
                       </m:r>
                     </m:e>
@@ -10906,11 +11407,17 @@
                       <m:sSup>
                         <m:e>
                           <m:r>
+                            <w:rPr>
+                              <w:highlight w:val="yellow"/>
+                            </w:rPr>
                             <m:t>x</m:t>
                           </m:r>
                         </m:e>
                         <m:sup>
                           <m:r>
+                            <w:rPr>
+                              <w:highlight w:val="yellow"/>
+                            </w:rPr>
                             <m:t>2</m:t>
                           </m:r>
                         </m:sup>
@@ -10919,21 +11426,36 @@
                         <m:rPr>
                           <m:sty m:val="p"/>
                         </m:rPr>
+                        <w:rPr>
+                          <w:highlight w:val="yellow"/>
+                        </w:rPr>
                         <m:t>+</m:t>
                       </m:r>
                       <m:r>
+                        <w:rPr>
+                          <w:highlight w:val="yellow"/>
+                        </w:rPr>
                         <m:t>2</m:t>
                       </m:r>
                       <m:r>
+                        <w:rPr>
+                          <w:highlight w:val="yellow"/>
+                        </w:rPr>
                         <m:t>x</m:t>
                       </m:r>
                       <m:r>
                         <m:rPr>
                           <m:sty m:val="p"/>
                         </m:rPr>
+                        <w:rPr>
+                          <w:highlight w:val="yellow"/>
+                        </w:rPr>
                         <m:t>−</m:t>
                       </m:r>
                       <m:r>
+                        <w:rPr>
+                          <w:highlight w:val="yellow"/>
+                        </w:rPr>
                         <m:t>5</m:t>
                       </m:r>
                     </m:sup>
@@ -10942,9 +11464,15 @@
                     <m:rPr>
                       <m:sty m:val="p"/>
                     </m:rPr>
+                    <w:rPr>
+                      <w:highlight w:val="yellow"/>
+                    </w:rPr>
                     <m:t>+</m:t>
                   </m:r>
                   <m:r>
+                    <w:rPr>
+                      <w:highlight w:val="yellow"/>
+                    </w:rPr>
                     <m:t>c</m:t>
                   </m:r>
                 </m:e>
@@ -11135,6 +11663,9 @@
               <m:borderBox>
                 <m:e>
                   <m:r>
+                    <w:rPr>
+                      <w:highlight w:val="yellow"/>
+                    </w:rPr>
                     <m:t>F</m:t>
                   </m:r>
                   <m:d>
@@ -11146,6 +11677,9 @@
                     </m:dPr>
                     <m:e>
                       <m:r>
+                        <w:rPr>
+                          <w:highlight w:val="yellow"/>
+                        </w:rPr>
                         <m:t>x</m:t>
                       </m:r>
                     </m:e>
@@ -11154,12 +11688,18 @@
                     <m:rPr>
                       <m:sty m:val="p"/>
                     </m:rPr>
+                    <w:rPr>
+                      <w:highlight w:val="yellow"/>
+                    </w:rPr>
                     <m:t>=</m:t>
                   </m:r>
                   <m:r>
                     <m:rPr>
                       <m:sty m:val="p"/>
                     </m:rPr>
+                    <w:rPr>
+                      <w:highlight w:val="yellow"/>
+                    </w:rPr>
                     <m:t>−</m:t>
                   </m:r>
                   <m:f>
@@ -11168,11 +11708,17 @@
                     </m:fPr>
                     <m:num>
                       <m:r>
+                        <w:rPr>
+                          <w:highlight w:val="yellow"/>
+                        </w:rPr>
                         <m:t>1</m:t>
                       </m:r>
                     </m:num>
                     <m:den>
                       <m:r>
+                        <w:rPr>
+                          <w:highlight w:val="yellow"/>
+                        </w:rPr>
                         <m:t>3</m:t>
                       </m:r>
                     </m:den>
@@ -11180,6 +11726,9 @@
                   <m:sSup>
                     <m:e>
                       <m:r>
+                        <w:rPr>
+                          <w:highlight w:val="yellow"/>
+                        </w:rPr>
                         <m:t>e</m:t>
                       </m:r>
                     </m:e>
@@ -11188,21 +11737,36 @@
                         <m:rPr>
                           <m:sty m:val="p"/>
                         </m:rPr>
+                        <w:rPr>
+                          <w:highlight w:val="yellow"/>
+                        </w:rPr>
                         <m:t>−</m:t>
                       </m:r>
                       <m:r>
+                        <w:rPr>
+                          <w:highlight w:val="yellow"/>
+                        </w:rPr>
                         <m:t>3</m:t>
                       </m:r>
                       <m:r>
+                        <w:rPr>
+                          <w:highlight w:val="yellow"/>
+                        </w:rPr>
                         <m:t>x</m:t>
                       </m:r>
                       <m:r>
                         <m:rPr>
                           <m:sty m:val="p"/>
                         </m:rPr>
+                        <w:rPr>
+                          <w:highlight w:val="yellow"/>
+                        </w:rPr>
                         <m:t>+</m:t>
                       </m:r>
                       <m:r>
+                        <w:rPr>
+                          <w:highlight w:val="yellow"/>
+                        </w:rPr>
                         <m:t>1</m:t>
                       </m:r>
                     </m:sup>
@@ -11211,9 +11775,15 @@
                     <m:rPr>
                       <m:sty m:val="p"/>
                     </m:rPr>
+                    <w:rPr>
+                      <w:highlight w:val="yellow"/>
+                    </w:rPr>
                     <m:t>+</m:t>
                   </m:r>
                   <m:r>
+                    <w:rPr>
+                      <w:highlight w:val="yellow"/>
+                    </w:rPr>
                     <m:t>c</m:t>
                   </m:r>
                 </m:e>
@@ -11241,6 +11811,9 @@
               <m:borderBox>
                 <m:e>
                   <m:r>
+                    <w:rPr>
+                      <w:highlight w:val="yellow"/>
+                    </w:rPr>
                     <m:t>G</m:t>
                   </m:r>
                   <m:d>
@@ -11252,6 +11825,9 @@
                     </m:dPr>
                     <m:e>
                       <m:r>
+                        <w:rPr>
+                          <w:highlight w:val="yellow"/>
+                        </w:rPr>
                         <m:t>x</m:t>
                       </m:r>
                     </m:e>
@@ -11260,12 +11836,18 @@
                     <m:rPr>
                       <m:sty m:val="p"/>
                     </m:rPr>
+                    <w:rPr>
+                      <w:highlight w:val="yellow"/>
+                    </w:rPr>
                     <m:t>=</m:t>
                   </m:r>
                   <m:r>
                     <m:rPr>
                       <m:sty m:val="p"/>
                     </m:rPr>
+                    <w:rPr>
+                      <w:highlight w:val="yellow"/>
+                    </w:rPr>
                     <m:t>−</m:t>
                   </m:r>
                   <m:f>
@@ -11274,11 +11856,17 @@
                     </m:fPr>
                     <m:num>
                       <m:r>
+                        <w:rPr>
+                          <w:highlight w:val="yellow"/>
+                        </w:rPr>
                         <m:t>1</m:t>
                       </m:r>
                     </m:num>
                     <m:den>
                       <m:r>
+                        <w:rPr>
+                          <w:highlight w:val="yellow"/>
+                        </w:rPr>
                         <m:t>2</m:t>
                       </m:r>
                     </m:den>
@@ -11287,6 +11875,9 @@
                     <m:rPr>
                       <m:sty m:val="p"/>
                     </m:rPr>
+                    <w:rPr>
+                      <w:highlight w:val="yellow"/>
+                    </w:rPr>
                     <m:t>cos</m:t>
                   </m:r>
                   <m:d>
@@ -11298,18 +11889,30 @@
                     </m:dPr>
                     <m:e>
                       <m:r>
+                        <w:rPr>
+                          <w:highlight w:val="yellow"/>
+                        </w:rPr>
                         <m:t>2</m:t>
                       </m:r>
                       <m:r>
+                        <w:rPr>
+                          <w:highlight w:val="yellow"/>
+                        </w:rPr>
                         <m:t>x</m:t>
                       </m:r>
                       <m:r>
                         <m:rPr>
                           <m:sty m:val="p"/>
                         </m:rPr>
+                        <w:rPr>
+                          <w:highlight w:val="yellow"/>
+                        </w:rPr>
                         <m:t>+</m:t>
                       </m:r>
                       <m:r>
+                        <w:rPr>
+                          <w:highlight w:val="yellow"/>
+                        </w:rPr>
                         <m:t>1</m:t>
                       </m:r>
                     </m:e>
@@ -11318,9 +11921,15 @@
                     <m:rPr>
                       <m:sty m:val="p"/>
                     </m:rPr>
+                    <w:rPr>
+                      <w:highlight w:val="yellow"/>
+                    </w:rPr>
                     <m:t>+</m:t>
                   </m:r>
                   <m:r>
+                    <w:rPr>
+                      <w:highlight w:val="yellow"/>
+                    </w:rPr>
                     <m:t>c</m:t>
                   </m:r>
                 </m:e>
@@ -11646,6 +12255,9 @@
               <m:borderBox>
                 <m:e>
                   <m:r>
+                    <w:rPr>
+                      <w:highlight w:val="yellow"/>
+                    </w:rPr>
                     <m:t>F</m:t>
                   </m:r>
                   <m:d>
@@ -11657,6 +12269,9 @@
                     </m:dPr>
                     <m:e>
                       <m:r>
+                        <w:rPr>
+                          <w:highlight w:val="yellow"/>
+                        </w:rPr>
                         <m:t>x</m:t>
                       </m:r>
                     </m:e>
@@ -11665,24 +12280,39 @@
                     <m:rPr>
                       <m:sty m:val="p"/>
                     </m:rPr>
+                    <w:rPr>
+                      <w:highlight w:val="yellow"/>
+                    </w:rPr>
                     <m:t>=</m:t>
                   </m:r>
                   <m:r>
+                    <w:rPr>
+                      <w:highlight w:val="yellow"/>
+                    </w:rPr>
                     <m:t>2</m:t>
                   </m:r>
                   <m:r>
+                    <w:rPr>
+                      <w:highlight w:val="yellow"/>
+                    </w:rPr>
                     <m:t>x</m:t>
                   </m:r>
                   <m:r>
                     <m:rPr>
                       <m:sty m:val="p"/>
                     </m:rPr>
+                    <w:rPr>
+                      <w:highlight w:val="yellow"/>
+                    </w:rPr>
                     <m:t>+</m:t>
                   </m:r>
                   <m:r>
                     <m:rPr>
                       <m:sty m:val="p"/>
                     </m:rPr>
+                    <w:rPr>
+                      <w:highlight w:val="yellow"/>
+                    </w:rPr>
                     <m:t>ln</m:t>
                   </m:r>
                   <m:d>
@@ -11694,15 +12324,24 @@
                     </m:dPr>
                     <m:e>
                       <m:r>
+                        <w:rPr>
+                          <w:highlight w:val="yellow"/>
+                        </w:rPr>
                         <m:t>x</m:t>
                       </m:r>
                       <m:r>
                         <m:rPr>
                           <m:sty m:val="p"/>
                         </m:rPr>
+                        <w:rPr>
+                          <w:highlight w:val="yellow"/>
+                        </w:rPr>
                         <m:t>+</m:t>
                       </m:r>
                       <m:r>
+                        <w:rPr>
+                          <w:highlight w:val="yellow"/>
+                        </w:rPr>
                         <m:t>1</m:t>
                       </m:r>
                     </m:e>
@@ -11711,9 +12350,15 @@
                     <m:rPr>
                       <m:sty m:val="p"/>
                     </m:rPr>
+                    <w:rPr>
+                      <w:highlight w:val="yellow"/>
+                    </w:rPr>
                     <m:t>+</m:t>
                   </m:r>
                   <m:r>
+                    <w:rPr>
+                      <w:highlight w:val="yellow"/>
+                    </w:rPr>
                     <m:t>c</m:t>
                   </m:r>
                 </m:e>
@@ -11881,6 +12526,9 @@
               <m:borderBox>
                 <m:e>
                   <m:r>
+                    <w:rPr>
+                      <w:highlight w:val="yellow"/>
+                    </w:rPr>
                     <m:t>F</m:t>
                   </m:r>
                   <m:d>
@@ -11892,6 +12540,9 @@
                     </m:dPr>
                     <m:e>
                       <m:r>
+                        <w:rPr>
+                          <w:highlight w:val="yellow"/>
+                        </w:rPr>
                         <m:t>x</m:t>
                       </m:r>
                     </m:e>
@@ -11900,12 +12551,18 @@
                     <m:rPr>
                       <m:sty m:val="p"/>
                     </m:rPr>
+                    <w:rPr>
+                      <w:highlight w:val="yellow"/>
+                    </w:rPr>
                     <m:t>=</m:t>
                   </m:r>
                   <m:r>
                     <m:rPr>
                       <m:sty m:val="p"/>
                     </m:rPr>
+                    <w:rPr>
+                      <w:highlight w:val="yellow"/>
+                    </w:rPr>
                     <m:t>ln</m:t>
                   </m:r>
                   <m:d>
@@ -11917,15 +12574,24 @@
                     </m:dPr>
                     <m:e>
                       <m:r>
+                        <w:rPr>
+                          <w:highlight w:val="yellow"/>
+                        </w:rPr>
                         <m:t>x</m:t>
                       </m:r>
                       <m:r>
                         <m:rPr>
                           <m:sty m:val="p"/>
                         </m:rPr>
+                        <w:rPr>
+                          <w:highlight w:val="yellow"/>
+                        </w:rPr>
                         <m:t>−</m:t>
                       </m:r>
                       <m:r>
+                        <w:rPr>
+                          <w:highlight w:val="yellow"/>
+                        </w:rPr>
                         <m:t>2</m:t>
                       </m:r>
                     </m:e>
@@ -11934,12 +12600,18 @@
                     <m:rPr>
                       <m:sty m:val="p"/>
                     </m:rPr>
+                    <w:rPr>
+                      <w:highlight w:val="yellow"/>
+                    </w:rPr>
                     <m:t>−</m:t>
                   </m:r>
                   <m:r>
                     <m:rPr>
                       <m:sty m:val="p"/>
                     </m:rPr>
+                    <w:rPr>
+                      <w:highlight w:val="yellow"/>
+                    </w:rPr>
                     <m:t>ln</m:t>
                   </m:r>
                   <m:d>
@@ -11951,15 +12623,24 @@
                     </m:dPr>
                     <m:e>
                       <m:r>
+                        <w:rPr>
+                          <w:highlight w:val="yellow"/>
+                        </w:rPr>
                         <m:t>x</m:t>
                       </m:r>
                       <m:r>
                         <m:rPr>
                           <m:sty m:val="p"/>
                         </m:rPr>
+                        <w:rPr>
+                          <w:highlight w:val="yellow"/>
+                        </w:rPr>
                         <m:t>+</m:t>
                       </m:r>
                       <m:r>
+                        <w:rPr>
+                          <w:highlight w:val="yellow"/>
+                        </w:rPr>
                         <m:t>2</m:t>
                       </m:r>
                     </m:e>
@@ -11968,21 +12649,33 @@
                     <m:rPr>
                       <m:sty m:val="p"/>
                     </m:rPr>
+                    <w:rPr>
+                      <w:highlight w:val="yellow"/>
+                    </w:rPr>
                     <m:t>+</m:t>
                   </m:r>
                   <m:r>
+                    <w:rPr>
+                      <w:highlight w:val="yellow"/>
+                    </w:rPr>
                     <m:t>c</m:t>
                   </m:r>
                   <m:r>
                     <m:rPr>
                       <m:sty m:val="p"/>
                     </m:rPr>
+                    <w:rPr>
+                      <w:highlight w:val="yellow"/>
+                    </w:rPr>
                     <m:t>=</m:t>
                   </m:r>
                   <m:r>
                     <m:rPr>
                       <m:sty m:val="p"/>
                     </m:rPr>
+                    <w:rPr>
+                      <w:highlight w:val="yellow"/>
+                    </w:rPr>
                     <m:t>ln</m:t>
                   </m:r>
                   <m:f>
@@ -11991,29 +12684,47 @@
                     </m:fPr>
                     <m:num>
                       <m:r>
+                        <w:rPr>
+                          <w:highlight w:val="yellow"/>
+                        </w:rPr>
                         <m:t>x</m:t>
                       </m:r>
                       <m:r>
                         <m:rPr>
                           <m:sty m:val="p"/>
                         </m:rPr>
+                        <w:rPr>
+                          <w:highlight w:val="yellow"/>
+                        </w:rPr>
                         <m:t>−</m:t>
                       </m:r>
                       <m:r>
+                        <w:rPr>
+                          <w:highlight w:val="yellow"/>
+                        </w:rPr>
                         <m:t>2</m:t>
                       </m:r>
                     </m:num>
                     <m:den>
                       <m:r>
+                        <w:rPr>
+                          <w:highlight w:val="yellow"/>
+                        </w:rPr>
                         <m:t>x</m:t>
                       </m:r>
                       <m:r>
                         <m:rPr>
                           <m:sty m:val="p"/>
                         </m:rPr>
+                        <w:rPr>
+                          <w:highlight w:val="yellow"/>
+                        </w:rPr>
                         <m:t>+</m:t>
                       </m:r>
                       <m:r>
+                        <w:rPr>
+                          <w:highlight w:val="yellow"/>
+                        </w:rPr>
                         <m:t>2</m:t>
                       </m:r>
                     </m:den>
@@ -12022,9 +12733,15 @@
                     <m:rPr>
                       <m:sty m:val="p"/>
                     </m:rPr>
+                    <w:rPr>
+                      <w:highlight w:val="yellow"/>
+                    </w:rPr>
                     <m:t>+</m:t>
                   </m:r>
                   <m:r>
+                    <w:rPr>
+                      <w:highlight w:val="yellow"/>
+                    </w:rPr>
                     <m:t>c</m:t>
                   </m:r>
                 </m:e>
@@ -13862,18 +14579,27 @@
               <m:borderBox>
                 <m:e>
                   <m:r>
+                    <w:rPr>
+                      <w:highlight w:val="yellow"/>
+                    </w:rPr>
                     <m:t>y</m:t>
                   </m:r>
                   <m:r>
                     <m:rPr>
                       <m:sty m:val="p"/>
                     </m:rPr>
+                    <w:rPr>
+                      <w:highlight w:val="yellow"/>
+                    </w:rPr>
                     <m:t>=</m:t>
                   </m:r>
                   <m:r>
                     <m:rPr>
                       <m:sty m:val="p"/>
                     </m:rPr>
+                    <w:rPr>
+                      <w:highlight w:val="yellow"/>
+                    </w:rPr>
                     <m:t>−</m:t>
                   </m:r>
                   <m:f>
@@ -13882,20 +14608,32 @@
                     </m:fPr>
                     <m:num>
                       <m:r>
+                        <w:rPr>
+                          <w:highlight w:val="yellow"/>
+                        </w:rPr>
                         <m:t>1</m:t>
                       </m:r>
                     </m:num>
                     <m:den>
                       <m:r>
+                        <w:rPr>
+                          <w:highlight w:val="yellow"/>
+                        </w:rPr>
                         <m:t>x</m:t>
                       </m:r>
                       <m:r>
                         <m:rPr>
                           <m:sty m:val="p"/>
                         </m:rPr>
+                        <w:rPr>
+                          <w:highlight w:val="yellow"/>
+                        </w:rPr>
                         <m:t>+</m:t>
                       </m:r>
                       <m:r>
+                        <w:rPr>
+                          <w:highlight w:val="yellow"/>
+                        </w:rPr>
                         <m:t>1</m:t>
                       </m:r>
                     </m:den>
@@ -13904,9 +14642,15 @@
                     <m:rPr>
                       <m:sty m:val="p"/>
                     </m:rPr>
+                    <w:rPr>
+                      <w:highlight w:val="yellow"/>
+                    </w:rPr>
                     <m:t>+</m:t>
                   </m:r>
                   <m:r>
+                    <w:rPr>
+                      <w:highlight w:val="yellow"/>
+                    </w:rPr>
                     <m:t>c</m:t>
                   </m:r>
                 </m:e>
@@ -14231,17 +14975,26 @@
               <m:borderBox>
                 <m:e>
                   <m:r>
+                    <w:rPr>
+                      <w:highlight w:val="yellow"/>
+                    </w:rPr>
                     <m:t>y</m:t>
                   </m:r>
                   <m:r>
                     <m:rPr>
                       <m:sty m:val="p"/>
                     </m:rPr>
+                    <w:rPr>
+                      <w:highlight w:val="yellow"/>
+                    </w:rPr>
                     <m:t>=</m:t>
                   </m:r>
                   <m:sSup>
                     <m:e>
                       <m:r>
+                        <w:rPr>
+                          <w:highlight w:val="yellow"/>
+                        </w:rPr>
                         <m:t>e</m:t>
                       </m:r>
                     </m:e>
@@ -14249,11 +15002,17 @@
                       <m:sSup>
                         <m:e>
                           <m:r>
+                            <w:rPr>
+                              <w:highlight w:val="yellow"/>
+                            </w:rPr>
                             <m:t>x</m:t>
                           </m:r>
                         </m:e>
                         <m:sup>
                           <m:r>
+                            <w:rPr>
+                              <w:highlight w:val="yellow"/>
+                            </w:rPr>
                             <m:t>2</m:t>
                           </m:r>
                         </m:sup>
@@ -14264,9 +15023,15 @@
                     <m:rPr>
                       <m:sty m:val="p"/>
                     </m:rPr>
+                    <w:rPr>
+                      <w:highlight w:val="yellow"/>
+                    </w:rPr>
                     <m:t>+</m:t>
                   </m:r>
                   <m:r>
+                    <w:rPr>
+                      <w:highlight w:val="yellow"/>
+                    </w:rPr>
                     <m:t>2</m:t>
                   </m:r>
                 </m:e>
@@ -14620,12 +15385,18 @@
               <m:borderBox>
                 <m:e>
                   <m:r>
+                    <w:rPr>
+                      <w:highlight w:val="yellow"/>
+                    </w:rPr>
                     <m:t>y</m:t>
                   </m:r>
                   <m:r>
                     <m:rPr>
                       <m:sty m:val="p"/>
                     </m:rPr>
+                    <w:rPr>
+                      <w:highlight w:val="yellow"/>
+                    </w:rPr>
                     <m:t>=</m:t>
                   </m:r>
                   <m:f>
@@ -14634,11 +15405,17 @@
                     </m:fPr>
                     <m:num>
                       <m:r>
+                        <w:rPr>
+                          <w:highlight w:val="yellow"/>
+                        </w:rPr>
                         <m:t>1</m:t>
                       </m:r>
                     </m:num>
                     <m:den>
                       <m:r>
+                        <w:rPr>
+                          <w:highlight w:val="yellow"/>
+                        </w:rPr>
                         <m:t>2</m:t>
                       </m:r>
                     </m:den>
@@ -14647,6 +15424,9 @@
                     <m:rPr>
                       <m:sty m:val="p"/>
                     </m:rPr>
+                    <w:rPr>
+                      <w:highlight w:val="yellow"/>
+                    </w:rPr>
                     <m:t>sin</m:t>
                   </m:r>
                   <m:d>
@@ -14658,9 +15438,15 @@
                     </m:dPr>
                     <m:e>
                       <m:r>
+                        <w:rPr>
+                          <w:highlight w:val="yellow"/>
+                        </w:rPr>
                         <m:t>2</m:t>
                       </m:r>
                       <m:r>
+                        <w:rPr>
+                          <w:highlight w:val="yellow"/>
+                        </w:rPr>
                         <m:t>x</m:t>
                       </m:r>
                     </m:e>
@@ -14669,6 +15455,9 @@
                     <m:rPr>
                       <m:sty m:val="p"/>
                     </m:rPr>
+                    <w:rPr>
+                      <w:highlight w:val="yellow"/>
+                    </w:rPr>
                     <m:t>+</m:t>
                   </m:r>
                   <m:f>
@@ -14677,11 +15466,17 @@
                     </m:fPr>
                     <m:num>
                       <m:r>
+                        <w:rPr>
+                          <w:highlight w:val="yellow"/>
+                        </w:rPr>
                         <m:t>1</m:t>
                       </m:r>
                     </m:num>
                     <m:den>
                       <m:r>
+                        <w:rPr>
+                          <w:highlight w:val="yellow"/>
+                        </w:rPr>
                         <m:t>2</m:t>
                       </m:r>
                     </m:den>
@@ -15652,6 +16447,9 @@
               <m:borderBox>
                 <m:e>
                   <m:r>
+                    <w:rPr>
+                      <w:highlight w:val="yellow"/>
+                    </w:rPr>
                     <m:t>2</m:t>
                   </m:r>
                 </m:e>
@@ -15794,6 +16592,9 @@
               <m:borderBox>
                 <m:e>
                   <m:r>
+                    <w:rPr>
+                      <w:highlight w:val="yellow"/>
+                    </w:rPr>
                     <m:t>1</m:t>
                   </m:r>
                 </m:e>
@@ -16028,11 +16829,17 @@
                     </m:fPr>
                     <m:num>
                       <m:r>
+                        <w:rPr>
+                          <w:highlight w:val="yellow"/>
+                        </w:rPr>
                         <m:t>1</m:t>
                       </m:r>
                     </m:num>
                     <m:den>
                       <m:r>
+                        <w:rPr>
+                          <w:highlight w:val="yellow"/>
+                        </w:rPr>
                         <m:t>2</m:t>
                       </m:r>
                     </m:den>
@@ -16048,11 +16855,17 @@
                       <m:sSup>
                         <m:e>
                           <m:r>
+                            <w:rPr>
+                              <w:highlight w:val="yellow"/>
+                            </w:rPr>
                             <m:t>e</m:t>
                           </m:r>
                         </m:e>
                         <m:sup>
                           <m:r>
+                            <w:rPr>
+                              <w:highlight w:val="yellow"/>
+                            </w:rPr>
                             <m:t>4</m:t>
                           </m:r>
                         </m:sup>
@@ -16061,9 +16874,15 @@
                         <m:rPr>
                           <m:sty m:val="p"/>
                         </m:rPr>
+                        <w:rPr>
+                          <w:highlight w:val="yellow"/>
+                        </w:rPr>
                         <m:t>−</m:t>
                       </m:r>
                       <m:r>
+                        <w:rPr>
+                          <w:highlight w:val="yellow"/>
+                        </w:rPr>
                         <m:t>1</m:t>
                       </m:r>
                     </m:e>
@@ -16214,6 +17033,9 @@
               <m:borderBox>
                 <m:e>
                   <m:r>
+                    <w:rPr>
+                      <w:highlight w:val="yellow"/>
+                    </w:rPr>
                     <m:t>1</m:t>
                   </m:r>
                 </m:e>
@@ -16392,11 +17214,17 @@
                     </m:fPr>
                     <m:num>
                       <m:r>
+                        <w:rPr>
+                          <w:highlight w:val="yellow"/>
+                        </w:rPr>
                         <m:t>1</m:t>
                       </m:r>
                     </m:num>
                     <m:den>
                       <m:r>
+                        <w:rPr>
+                          <w:highlight w:val="yellow"/>
+                        </w:rPr>
                         <m:t>2</m:t>
                       </m:r>
                     </m:den>
@@ -16405,9 +17233,15 @@
                     <m:rPr>
                       <m:sty m:val="p"/>
                     </m:rPr>
+                    <w:rPr>
+                      <w:highlight w:val="yellow"/>
+                    </w:rPr>
                     <m:t>ln</m:t>
                   </m:r>
                   <m:r>
+                    <w:rPr>
+                      <w:highlight w:val="yellow"/>
+                    </w:rPr>
                     <m:t>2</m:t>
                   </m:r>
                 </m:e>
@@ -17949,11 +18783,17 @@
                       </m:fPr>
                       <m:num>
                         <m:r>
+                          <w:rPr>
+                            <w:highlight w:val="yellow"/>
+                          </w:rPr>
                           <m:t>5</m:t>
                         </m:r>
                       </m:num>
                       <m:den>
                         <m:r>
+                          <w:rPr>
+                            <w:highlight w:val="yellow"/>
+                          </w:rPr>
                           <m:t>2</m:t>
                         </m:r>
                       </m:den>
@@ -18527,6 +19367,9 @@
                     <m:rPr>
                       <m:sty m:val="p"/>
                     </m:rPr>
+                    <w:rPr>
+                      <w:highlight w:val="yellow"/>
+                    </w:rPr>
                     <m:t>ln</m:t>
                   </m:r>
                   <m:f>
@@ -18535,20 +19378,32 @@
                     </m:fPr>
                     <m:num>
                       <m:r>
+                        <w:rPr>
+                          <w:highlight w:val="yellow"/>
+                        </w:rPr>
                         <m:t>e</m:t>
                       </m:r>
                       <m:r>
                         <m:rPr>
                           <m:sty m:val="p"/>
                         </m:rPr>
+                        <w:rPr>
+                          <w:highlight w:val="yellow"/>
+                        </w:rPr>
                         <m:t>+</m:t>
                       </m:r>
                       <m:r>
+                        <w:rPr>
+                          <w:highlight w:val="yellow"/>
+                        </w:rPr>
                         <m:t>1</m:t>
                       </m:r>
                     </m:num>
                     <m:den>
                       <m:r>
+                        <w:rPr>
+                          <w:highlight w:val="yellow"/>
+                        </w:rPr>
                         <m:t>2</m:t>
                       </m:r>
                     </m:den>
@@ -18572,27 +19427,42 @@
               <m:borderBox>
                 <m:e>
                   <m:r>
+                    <w:rPr>
+                      <w:highlight w:val="yellow"/>
+                    </w:rPr>
                     <m:t>J</m:t>
                   </m:r>
                   <m:r>
                     <m:rPr>
                       <m:sty m:val="p"/>
                     </m:rPr>
+                    <w:rPr>
+                      <w:highlight w:val="yellow"/>
+                    </w:rPr>
                     <m:t>=</m:t>
                   </m:r>
                   <m:r>
+                    <w:rPr>
+                      <w:highlight w:val="yellow"/>
+                    </w:rPr>
                     <m:t>1</m:t>
                   </m:r>
                   <m:r>
                     <m:rPr>
                       <m:sty m:val="p"/>
                     </m:rPr>
+                    <w:rPr>
+                      <w:highlight w:val="yellow"/>
+                    </w:rPr>
                     <m:t>−</m:t>
                   </m:r>
                   <m:r>
                     <m:rPr>
                       <m:sty m:val="p"/>
                     </m:rPr>
+                    <w:rPr>
+                      <w:highlight w:val="yellow"/>
+                    </w:rPr>
                     <m:t>ln</m:t>
                   </m:r>
                   <m:f>
@@ -18601,20 +19471,32 @@
                     </m:fPr>
                     <m:num>
                       <m:r>
+                        <w:rPr>
+                          <w:highlight w:val="yellow"/>
+                        </w:rPr>
                         <m:t>e</m:t>
                       </m:r>
                       <m:r>
                         <m:rPr>
                           <m:sty m:val="p"/>
                         </m:rPr>
+                        <w:rPr>
+                          <w:highlight w:val="yellow"/>
+                        </w:rPr>
                         <m:t>+</m:t>
                       </m:r>
                       <m:r>
+                        <w:rPr>
+                          <w:highlight w:val="yellow"/>
+                        </w:rPr>
                         <m:t>1</m:t>
                       </m:r>
                     </m:num>
                     <m:den>
                       <m:r>
+                        <w:rPr>
+                          <w:highlight w:val="yellow"/>
+                        </w:rPr>
                         <m:t>2</m:t>
                       </m:r>
                     </m:den>
@@ -20256,7 +21138,7 @@
                     <a:graphicData uri="http://schemas.openxmlformats.org/drawingml/2006/picture">
                       <pic:pic>
                         <pic:nvPicPr>
-                          <pic:cNvPr id="0" name="dc8958024df008eb.png"/>
+                          <pic:cNvPr id="0" name="3041fbbf496dede3.png"/>
                           <pic:cNvPicPr/>
                         </pic:nvPicPr>
                         <pic:blipFill>
@@ -20304,7 +21186,7 @@
                     <a:graphicData uri="http://schemas.openxmlformats.org/drawingml/2006/picture">
                       <pic:pic>
                         <pic:nvPicPr>
-                          <pic:cNvPr id="0" name="fb99eca2c9c69b74.png"/>
+                          <pic:cNvPr id="0" name="3630bb8b7a54a7b0.png"/>
                           <pic:cNvPicPr/>
                         </pic:nvPicPr>
                         <pic:blipFill>
@@ -21172,6 +22054,9 @@
                 <m:borderBox>
                   <m:e>
                     <m:r>
+                      <w:rPr>
+                        <w:highlight w:val="yellow"/>
+                      </w:rPr>
                       <m:t>3</m:t>
                     </m:r>
                   </m:e>
@@ -21277,7 +22162,7 @@
               <a:graphicData uri="http://schemas.openxmlformats.org/drawingml/2006/picture">
                 <pic:pic>
                   <pic:nvPicPr>
-                    <pic:cNvPr id="0" name="d453c6b4b463d8e4.png"/>
+                    <pic:cNvPr id="0" name="3f95d1eb4c9a7c7a.png"/>
                     <pic:cNvPicPr/>
                   </pic:nvPicPr>
                   <pic:blipFill>
@@ -22438,11 +23323,17 @@
                       </m:fPr>
                       <m:num>
                         <m:r>
+                          <w:rPr>
+                            <w:highlight w:val="yellow"/>
+                          </w:rPr>
                           <m:t>1</m:t>
                         </m:r>
                       </m:num>
                       <m:den>
                         <m:r>
+                          <w:rPr>
+                            <w:highlight w:val="yellow"/>
+                          </w:rPr>
                           <m:t>e</m:t>
                         </m:r>
                       </m:den>
@@ -22451,18 +23342,30 @@
                       <m:rPr>
                         <m:sty m:val="p"/>
                       </m:rPr>
+                      <w:rPr>
+                        <w:highlight w:val="yellow"/>
+                      </w:rPr>
                       <m:t>≤</m:t>
                     </m:r>
                     <m:r>
+                      <w:rPr>
+                        <w:highlight w:val="yellow"/>
+                      </w:rPr>
                       <m:t>I</m:t>
                     </m:r>
                     <m:r>
                       <m:rPr>
                         <m:sty m:val="p"/>
                       </m:rPr>
+                      <w:rPr>
+                        <w:highlight w:val="yellow"/>
+                      </w:rPr>
                       <m:t>≤</m:t>
                     </m:r>
                     <m:r>
+                      <w:rPr>
+                        <w:highlight w:val="yellow"/>
+                      </w:rPr>
                       <m:t>1</m:t>
                     </m:r>
                   </m:e>
@@ -24031,6 +24934,9 @@
                 <m:borderBox>
                   <m:e>
                     <m:r>
+                      <w:rPr>
+                        <w:highlight w:val="yellow"/>
+                      </w:rPr>
                       <m:t>1</m:t>
                     </m:r>
                   </m:e>
@@ -24440,6 +25346,9 @@
                 <m:borderBox>
                   <m:e>
                     <m:r>
+                      <w:rPr>
+                        <w:highlight w:val="yellow"/>
+                      </w:rPr>
                       <m:t>1</m:t>
                     </m:r>
                   </m:e>
@@ -25031,11 +25940,17 @@
                         <m:sSup>
                           <m:e>
                             <m:r>
+                              <w:rPr>
+                                <w:highlight w:val="yellow"/>
+                              </w:rPr>
                               <m:t>e</m:t>
                             </m:r>
                           </m:e>
                           <m:sup>
                             <m:r>
+                              <w:rPr>
+                                <w:highlight w:val="yellow"/>
+                              </w:rPr>
                               <m:t>2</m:t>
                             </m:r>
                           </m:sup>
@@ -25044,14 +25959,23 @@
                           <m:rPr>
                             <m:sty m:val="p"/>
                           </m:rPr>
+                          <w:rPr>
+                            <w:highlight w:val="yellow"/>
+                          </w:rPr>
                           <m:t>+</m:t>
                         </m:r>
                         <m:r>
+                          <w:rPr>
+                            <w:highlight w:val="yellow"/>
+                          </w:rPr>
                           <m:t>1</m:t>
                         </m:r>
                       </m:num>
                       <m:den>
                         <m:r>
+                          <w:rPr>
+                            <w:highlight w:val="yellow"/>
+                          </w:rPr>
                           <m:t>4</m:t>
                         </m:r>
                       </m:den>
@@ -25446,6 +26370,9 @@
                 <m:borderBox>
                   <m:e>
                     <m:r>
+                      <w:rPr>
+                        <w:highlight w:val="yellow"/>
+                      </w:rPr>
                       <m:t>π</m:t>
                     </m:r>
                   </m:e>
@@ -25836,24 +26763,39 @@
               <m:borderBox>
                 <m:e>
                   <m:r>
+                    <w:rPr>
+                      <w:highlight w:val="yellow"/>
+                    </w:rPr>
                     <m:t>M</m:t>
                   </m:r>
                   <m:r>
                     <m:rPr>
                       <m:sty m:val="p"/>
                     </m:rPr>
+                    <w:rPr>
+                      <w:highlight w:val="yellow"/>
+                    </w:rPr>
                     <m:t>=</m:t>
                   </m:r>
                   <m:r>
+                    <w:rPr>
+                      <w:highlight w:val="yellow"/>
+                    </w:rPr>
                     <m:t>e</m:t>
                   </m:r>
                   <m:r>
                     <m:rPr>
                       <m:sty m:val="p"/>
                     </m:rPr>
+                    <w:rPr>
+                      <w:highlight w:val="yellow"/>
+                    </w:rPr>
                     <m:t>−</m:t>
                   </m:r>
                   <m:r>
+                    <w:rPr>
+                      <w:highlight w:val="yellow"/>
+                    </w:rPr>
                     <m:t>2</m:t>
                   </m:r>
                 </m:e>
@@ -28011,7 +28953,7 @@
                     <a:graphicData uri="http://schemas.openxmlformats.org/drawingml/2006/picture">
                       <pic:pic>
                         <pic:nvPicPr>
-                          <pic:cNvPr id="0" name="76e432e4f42c3366.png"/>
+                          <pic:cNvPr id="0" name="397f0c4b0697a242.png"/>
                           <pic:cNvPicPr/>
                         </pic:nvPicPr>
                         <pic:blipFill>
@@ -28341,34 +29283,52 @@
                       </m:fPr>
                       <m:num>
                         <m:r>
+                          <w:rPr>
+                            <w:highlight w:val="yellow"/>
+                          </w:rPr>
                           <m:t>32</m:t>
                         </m:r>
                       </m:num>
                       <m:den>
                         <m:r>
+                          <w:rPr>
+                            <w:highlight w:val="yellow"/>
+                          </w:rPr>
                           <m:t>3</m:t>
                         </m:r>
                       </m:den>
                     </m:f>
                     <m:r>
+                      <w:rPr>
+                        <w:highlight w:val="yellow"/>
+                      </w:rPr>
                       <m:t> </m:t>
                     </m:r>
                     <m:r>
                       <m:rPr>
                         <m:sty m:val="p"/>
                       </m:rPr>
+                      <w:rPr>
+                        <w:highlight w:val="yellow"/>
+                      </w:rPr>
                       <m:t>u</m:t>
                     </m:r>
                     <m:r>
                       <m:rPr>
                         <m:sty m:val="p"/>
                       </m:rPr>
+                      <w:rPr>
+                        <w:highlight w:val="yellow"/>
+                      </w:rPr>
                       <m:t>.</m:t>
                     </m:r>
                     <m:r>
                       <m:rPr>
                         <m:sty m:val="p"/>
                       </m:rPr>
+                      <w:rPr>
+                        <w:highlight w:val="yellow"/>
+                      </w:rPr>
                       <m:t>a</m:t>
                     </m:r>
                   </m:e>
@@ -28396,7 +29356,7 @@
                     <a:graphicData uri="http://schemas.openxmlformats.org/drawingml/2006/picture">
                       <pic:pic>
                         <pic:nvPicPr>
-                          <pic:cNvPr id="0" name="11596c460226981d.png"/>
+                          <pic:cNvPr id="0" name="3f0125c9a51f1c49.png"/>
                           <pic:cNvPicPr/>
                         </pic:nvPicPr>
                         <pic:blipFill>
@@ -28638,7 +29598,7 @@
                     <a:graphicData uri="http://schemas.openxmlformats.org/drawingml/2006/picture">
                       <pic:pic>
                         <pic:nvPicPr>
-                          <pic:cNvPr id="0" name="e68182294a7397a0.png"/>
+                          <pic:cNvPr id="0" name="20572177de5e5c55.png"/>
                           <pic:cNvPicPr/>
                         </pic:nvPicPr>
                         <pic:blipFill>
@@ -29129,27 +30089,42 @@
                 <m:borderBox>
                   <m:e>
                     <m:r>
+                      <w:rPr>
+                        <w:highlight w:val="yellow"/>
+                      </w:rPr>
                       <m:t>2</m:t>
                     </m:r>
                     <m:r>
+                      <w:rPr>
+                        <w:highlight w:val="yellow"/>
+                      </w:rPr>
                       <m:t> </m:t>
                     </m:r>
                     <m:r>
                       <m:rPr>
                         <m:sty m:val="p"/>
                       </m:rPr>
+                      <w:rPr>
+                        <w:highlight w:val="yellow"/>
+                      </w:rPr>
                       <m:t>u</m:t>
                     </m:r>
                     <m:r>
                       <m:rPr>
                         <m:sty m:val="p"/>
                       </m:rPr>
+                      <w:rPr>
+                        <w:highlight w:val="yellow"/>
+                      </w:rPr>
                       <m:t>.</m:t>
                     </m:r>
                     <m:r>
                       <m:rPr>
                         <m:sty m:val="p"/>
                       </m:rPr>
+                      <w:rPr>
+                        <w:highlight w:val="yellow"/>
+                      </w:rPr>
                       <m:t>a</m:t>
                     </m:r>
                   </m:e>
@@ -29177,7 +30152,7 @@
                     <a:graphicData uri="http://schemas.openxmlformats.org/drawingml/2006/picture">
                       <pic:pic>
                         <pic:nvPicPr>
-                          <pic:cNvPr id="0" name="3f75b5b70def6ec3.png"/>
+                          <pic:cNvPr id="0" name="66147e9fdd38aacb.png"/>
                           <pic:cNvPicPr/>
                         </pic:nvPicPr>
                         <pic:blipFill>
@@ -30461,7 +31436,7 @@
               </w:rPr>
               <w:drawing>
                 <wp:inline>
-                  <wp:extent cx="2606040" cy="928115"/>
+                  <wp:extent cx="5628132" cy="1700784"/>
                   <wp:docPr id="8" name="Picture 8"/>
                   <wp:cNvGraphicFramePr>
                     <a:graphicFrameLocks noChangeAspect="1"/>
@@ -30470,7 +31445,7 @@
                     <a:graphicData uri="http://schemas.openxmlformats.org/drawingml/2006/picture">
                       <pic:pic>
                         <pic:nvPicPr>
-                          <pic:cNvPr id="0" name="1d742b23edf73bb2.png"/>
+                          <pic:cNvPr id="0" name="e56754b34a5b73ef.png"/>
                           <pic:cNvPicPr/>
                         </pic:nvPicPr>
                         <pic:blipFill>
@@ -30482,7 +31457,7 @@
                         <pic:spPr>
                           <a:xfrm>
                             <a:off x="0" y="0"/>
-                            <a:ext cx="2606040" cy="928115"/>
+                            <a:ext cx="5628132" cy="1700784"/>
                           </a:xfrm>
                           <a:prstGeom prst="rect"/>
                         </pic:spPr>
@@ -30781,34 +31756,52 @@
                       </m:fPr>
                       <m:num>
                         <m:r>
+                          <w:rPr>
+                            <w:highlight w:val="yellow"/>
+                          </w:rPr>
                           <m:t>9</m:t>
                         </m:r>
                       </m:num>
                       <m:den>
                         <m:r>
+                          <w:rPr>
+                            <w:highlight w:val="yellow"/>
+                          </w:rPr>
                           <m:t>2</m:t>
                         </m:r>
                       </m:den>
                     </m:f>
                     <m:r>
+                      <w:rPr>
+                        <w:highlight w:val="yellow"/>
+                      </w:rPr>
                       <m:t> </m:t>
                     </m:r>
                     <m:r>
                       <m:rPr>
                         <m:sty m:val="p"/>
                       </m:rPr>
+                      <w:rPr>
+                        <w:highlight w:val="yellow"/>
+                      </w:rPr>
                       <m:t>u</m:t>
                     </m:r>
                     <m:r>
                       <m:rPr>
                         <m:sty m:val="p"/>
                       </m:rPr>
+                      <w:rPr>
+                        <w:highlight w:val="yellow"/>
+                      </w:rPr>
                       <m:t>.</m:t>
                     </m:r>
                     <m:r>
                       <m:rPr>
                         <m:sty m:val="p"/>
                       </m:rPr>
+                      <w:rPr>
+                        <w:highlight w:val="yellow"/>
+                      </w:rPr>
                       <m:t>a</m:t>
                     </m:r>
                   </m:e>
@@ -30836,7 +31829,7 @@
                     <a:graphicData uri="http://schemas.openxmlformats.org/drawingml/2006/picture">
                       <pic:pic>
                         <pic:nvPicPr>
-                          <pic:cNvPr id="0" name="9124ba0044ac1a18.png"/>
+                          <pic:cNvPr id="0" name="19e323fd28c0ac15.png"/>
                           <pic:cNvPicPr/>
                         </pic:nvPicPr>
                         <pic:blipFill>
@@ -31144,7 +32137,7 @@
               </w:rPr>
               <w:drawing>
                 <wp:inline>
-                  <wp:extent cx="2606040" cy="928115"/>
+                  <wp:extent cx="5628132" cy="1700784"/>
                   <wp:docPr id="10" name="Picture 10"/>
                   <wp:cNvGraphicFramePr>
                     <a:graphicFrameLocks noChangeAspect="1"/>
@@ -31153,7 +32146,7 @@
                     <a:graphicData uri="http://schemas.openxmlformats.org/drawingml/2006/picture">
                       <pic:pic>
                         <pic:nvPicPr>
-                          <pic:cNvPr id="0" name="bbb0b1b134d491fe.png"/>
+                          <pic:cNvPr id="0" name="1892f98fc5c479dd.png"/>
                           <pic:cNvPicPr/>
                         </pic:nvPicPr>
                         <pic:blipFill>
@@ -31165,7 +32158,7 @@
                         <pic:spPr>
                           <a:xfrm>
                             <a:off x="0" y="0"/>
-                            <a:ext cx="2606040" cy="928115"/>
+                            <a:ext cx="5628132" cy="1700784"/>
                           </a:xfrm>
                           <a:prstGeom prst="rect"/>
                         </pic:spPr>
@@ -31418,17 +32411,26 @@
                 <m:borderBox>
                   <m:e>
                     <m:r>
+                      <w:rPr>
+                        <w:highlight w:val="yellow"/>
+                      </w:rPr>
                       <m:t>1</m:t>
                     </m:r>
                     <m:r>
                       <m:rPr>
                         <m:sty m:val="p"/>
                       </m:rPr>
+                      <w:rPr>
+                        <w:highlight w:val="yellow"/>
+                      </w:rPr>
                       <m:t>−</m:t>
                     </m:r>
                     <m:sSup>
                       <m:e>
                         <m:r>
+                          <w:rPr>
+                            <w:highlight w:val="yellow"/>
+                          </w:rPr>
                           <m:t>e</m:t>
                         </m:r>
                       </m:e>
@@ -31437,32 +32439,50 @@
                           <m:rPr>
                             <m:sty m:val="p"/>
                           </m:rPr>
+                          <w:rPr>
+                            <w:highlight w:val="yellow"/>
+                          </w:rPr>
                           <m:t>−</m:t>
                         </m:r>
                         <m:r>
+                          <w:rPr>
+                            <w:highlight w:val="yellow"/>
+                          </w:rPr>
                           <m:t>λ</m:t>
                         </m:r>
                       </m:sup>
                     </m:sSup>
                     <m:r>
+                      <w:rPr>
+                        <w:highlight w:val="yellow"/>
+                      </w:rPr>
                       <m:t> </m:t>
                     </m:r>
                     <m:r>
                       <m:rPr>
                         <m:sty m:val="p"/>
                       </m:rPr>
+                      <w:rPr>
+                        <w:highlight w:val="yellow"/>
+                      </w:rPr>
                       <m:t>u</m:t>
                     </m:r>
                     <m:r>
                       <m:rPr>
                         <m:sty m:val="p"/>
                       </m:rPr>
+                      <w:rPr>
+                        <w:highlight w:val="yellow"/>
+                      </w:rPr>
                       <m:t>.</m:t>
                     </m:r>
                     <m:r>
                       <m:rPr>
                         <m:sty m:val="p"/>
                       </m:rPr>
+                      <w:rPr>
+                        <w:highlight w:val="yellow"/>
+                      </w:rPr>
                       <m:t>a</m:t>
                     </m:r>
                   </m:e>
@@ -31757,7 +32777,7 @@
                     <a:graphicData uri="http://schemas.openxmlformats.org/drawingml/2006/picture">
                       <pic:pic>
                         <pic:nvPicPr>
-                          <pic:cNvPr id="0" name="9ec87bbb57111236.png"/>
+                          <pic:cNvPr id="0" name="00b67a11dac7b9c6.png"/>
                           <pic:cNvPicPr/>
                         </pic:nvPicPr>
                         <pic:blipFill>
@@ -32445,9 +33465,15 @@
               <m:borderBox>
                 <m:e>
                   <m:r>
+                    <w:rPr>
+                      <w:highlight w:val="yellow"/>
+                    </w:rPr>
                     <m:t>8</m:t>
                   </m:r>
                   <m:r>
+                    <w:rPr>
+                      <w:highlight w:val="yellow"/>
+                    </w:rPr>
                     <m:t>π</m:t>
                   </m:r>
                 </m:e>
@@ -33615,6 +34641,9 @@
               <m:borderBox>
                 <m:e>
                   <m:r>
+                    <w:rPr>
+                      <w:highlight w:val="yellow"/>
+                    </w:rPr>
                     <m:t>F</m:t>
                   </m:r>
                   <m:d>
@@ -33626,6 +34655,9 @@
                     </m:dPr>
                     <m:e>
                       <m:r>
+                        <w:rPr>
+                          <w:highlight w:val="yellow"/>
+                        </w:rPr>
                         <m:t>x</m:t>
                       </m:r>
                     </m:e>
@@ -33634,36 +34666,60 @@
                     <m:rPr>
                       <m:sty m:val="p"/>
                     </m:rPr>
+                    <w:rPr>
+                      <w:highlight w:val="yellow"/>
+                    </w:rPr>
                     <m:t>=</m:t>
                   </m:r>
                   <m:r>
+                    <w:rPr>
+                      <w:highlight w:val="yellow"/>
+                    </w:rPr>
                     <m:t>x</m:t>
                   </m:r>
                   <m:r>
                     <m:rPr>
                       <m:sty m:val="p"/>
                     </m:rPr>
+                    <w:rPr>
+                      <w:highlight w:val="yellow"/>
+                    </w:rPr>
                     <m:t>ln</m:t>
                   </m:r>
                   <m:r>
+                    <w:rPr>
+                      <w:highlight w:val="yellow"/>
+                    </w:rPr>
                     <m:t>x</m:t>
                   </m:r>
                   <m:r>
                     <m:rPr>
                       <m:sty m:val="p"/>
                     </m:rPr>
+                    <w:rPr>
+                      <w:highlight w:val="yellow"/>
+                    </w:rPr>
                     <m:t>−</m:t>
                   </m:r>
                   <m:r>
+                    <w:rPr>
+                      <w:highlight w:val="yellow"/>
+                    </w:rPr>
                     <m:t>x</m:t>
                   </m:r>
                   <m:r>
                     <m:rPr>
                       <m:sty m:val="p"/>
                     </m:rPr>
+                    <w:rPr>
+                      <w:highlight w:val="yellow"/>
+                    </w:rPr>
                     <m:t>+</m:t>
                   </m:r>
                   <m:r>
+                    <w:rPr>
+                      <w:highlight w:val="yellow"/>
+                    </w:rPr>
                     <m:t>1</m:t>
                   </m:r>
                 </m:e>
@@ -34160,6 +35216,9 @@
               <m:borderBox>
                 <m:e>
                   <m:r>
+                    <w:rPr>
+                      <w:highlight w:val="yellow"/>
+                    </w:rPr>
                     <m:t>F</m:t>
                   </m:r>
                   <m:d>
@@ -34171,6 +35230,9 @@
                     </m:dPr>
                     <m:e>
                       <m:r>
+                        <w:rPr>
+                          <w:highlight w:val="yellow"/>
+                        </w:rPr>
                         <m:t>x</m:t>
                       </m:r>
                     </m:e>
@@ -34179,6 +35241,9 @@
                     <m:rPr>
                       <m:sty m:val="p"/>
                     </m:rPr>
+                    <w:rPr>
+                      <w:highlight w:val="yellow"/>
+                    </w:rPr>
                     <m:t>=</m:t>
                   </m:r>
                   <m:d>
@@ -34190,15 +35255,24 @@
                     </m:dPr>
                     <m:e>
                       <m:r>
+                        <w:rPr>
+                          <w:highlight w:val="yellow"/>
+                        </w:rPr>
                         <m:t>x</m:t>
                       </m:r>
                       <m:r>
                         <m:rPr>
                           <m:sty m:val="p"/>
                         </m:rPr>
+                        <w:rPr>
+                          <w:highlight w:val="yellow"/>
+                        </w:rPr>
                         <m:t>−</m:t>
                       </m:r>
                       <m:r>
+                        <w:rPr>
+                          <w:highlight w:val="yellow"/>
+                        </w:rPr>
                         <m:t>1</m:t>
                       </m:r>
                     </m:e>
@@ -34206,11 +35280,17 @@
                   <m:sSup>
                     <m:e>
                       <m:r>
+                        <w:rPr>
+                          <w:highlight w:val="yellow"/>
+                        </w:rPr>
                         <m:t>e</m:t>
                       </m:r>
                     </m:e>
                     <m:sup>
                       <m:r>
+                        <w:rPr>
+                          <w:highlight w:val="yellow"/>
+                        </w:rPr>
                         <m:t>x</m:t>
                       </m:r>
                     </m:sup>
@@ -34219,9 +35299,15 @@
                     <m:rPr>
                       <m:sty m:val="p"/>
                     </m:rPr>
+                    <w:rPr>
+                      <w:highlight w:val="yellow"/>
+                    </w:rPr>
                     <m:t>+</m:t>
                   </m:r>
                   <m:r>
+                    <w:rPr>
+                      <w:highlight w:val="yellow"/>
+                    </w:rPr>
                     <m:t>1</m:t>
                   </m:r>
                 </m:e>
@@ -35333,7 +36419,7 @@
                     <a:graphicData uri="http://schemas.openxmlformats.org/drawingml/2006/picture">
                       <pic:pic>
                         <pic:nvPicPr>
-                          <pic:cNvPr id="0" name="bca2fc0db67600f5.png"/>
+                          <pic:cNvPr id="0" name="7cd67245f195c4d0.png"/>
                           <pic:cNvPicPr/>
                         </pic:nvPicPr>
                         <pic:blipFill>
@@ -35903,6 +36989,9 @@
                 <m:borderBox>
                   <m:e>
                     <m:r>
+                      <w:rPr>
+                        <w:highlight w:val="yellow"/>
+                      </w:rPr>
                       <m:t>F</m:t>
                     </m:r>
                     <m:d>
@@ -35914,6 +37003,9 @@
                       </m:dPr>
                       <m:e>
                         <m:r>
+                          <w:rPr>
+                            <w:highlight w:val="yellow"/>
+                          </w:rPr>
                           <m:t>x</m:t>
                         </m:r>
                       </m:e>
@@ -35922,6 +37014,9 @@
                       <m:rPr>
                         <m:sty m:val="p"/>
                       </m:rPr>
+                      <w:rPr>
+                        <w:highlight w:val="yellow"/>
+                      </w:rPr>
                       <m:t>=</m:t>
                     </m:r>
                     <m:d>
@@ -35933,15 +37028,24 @@
                       </m:dPr>
                       <m:e>
                         <m:r>
+                          <w:rPr>
+                            <w:highlight w:val="yellow"/>
+                          </w:rPr>
                           <m:t>3</m:t>
                         </m:r>
                         <m:r>
                           <m:rPr>
                             <m:sty m:val="p"/>
                           </m:rPr>
+                          <w:rPr>
+                            <w:highlight w:val="yellow"/>
+                          </w:rPr>
                           <m:t>−</m:t>
                         </m:r>
                         <m:r>
+                          <w:rPr>
+                            <w:highlight w:val="yellow"/>
+                          </w:rPr>
                           <m:t>x</m:t>
                         </m:r>
                       </m:e>
@@ -35949,11 +37053,17 @@
                     <m:sSup>
                       <m:e>
                         <m:r>
+                          <w:rPr>
+                            <w:highlight w:val="yellow"/>
+                          </w:rPr>
                           <m:t>e</m:t>
                         </m:r>
                       </m:e>
                       <m:sup>
                         <m:r>
+                          <w:rPr>
+                            <w:highlight w:val="yellow"/>
+                          </w:rPr>
                           <m:t>x</m:t>
                         </m:r>
                       </m:sup>
@@ -36331,7 +37441,7 @@
                     <a:graphicData uri="http://schemas.openxmlformats.org/drawingml/2006/picture">
                       <pic:pic>
                         <pic:nvPicPr>
-                          <pic:cNvPr id="0" name="9724823cda58a1e3.png"/>
+                          <pic:cNvPr id="0" name="81f6d5e01bf5451e.png"/>
                           <pic:cNvPicPr/>
                         </pic:nvPicPr>
                         <pic:blipFill>
@@ -36881,15 +37991,24 @@
                         <m:sty m:val="p"/>
                         <m:scr m:val="script"/>
                       </m:rPr>
+                      <w:rPr>
+                        <w:highlight w:val="yellow"/>
+                      </w:rPr>
                       <m:t>A</m:t>
                     </m:r>
                     <m:r>
                       <m:rPr>
                         <m:sty m:val="p"/>
                       </m:rPr>
+                      <w:rPr>
+                        <w:highlight w:val="yellow"/>
+                      </w:rPr>
                       <m:t>=</m:t>
                     </m:r>
                     <m:r>
+                      <w:rPr>
+                        <w:highlight w:val="yellow"/>
+                      </w:rPr>
                       <m:t>4</m:t>
                     </m:r>
                     <m:d>
@@ -36903,11 +38022,17 @@
                         <m:sSup>
                           <m:e>
                             <m:r>
+                              <w:rPr>
+                                <w:highlight w:val="yellow"/>
+                              </w:rPr>
                               <m:t>e</m:t>
                             </m:r>
                           </m:e>
                           <m:sup>
                             <m:r>
+                              <w:rPr>
+                                <w:highlight w:val="yellow"/>
+                              </w:rPr>
                               <m:t>2</m:t>
                             </m:r>
                           </m:sup>
@@ -36916,14 +38041,23 @@
                           <m:rPr>
                             <m:sty m:val="p"/>
                           </m:rPr>
+                          <w:rPr>
+                            <w:highlight w:val="yellow"/>
+                          </w:rPr>
                           <m:t>−</m:t>
                         </m:r>
                         <m:r>
+                          <w:rPr>
+                            <w:highlight w:val="yellow"/>
+                          </w:rPr>
                           <m:t>3</m:t>
                         </m:r>
                       </m:e>
                     </m:d>
                     <m:r>
+                      <w:rPr>
+                        <w:highlight w:val="yellow"/>
+                      </w:rPr>
                       <m:t> </m:t>
                     </m:r>
                     <m:sSup>
@@ -36932,17 +38066,26 @@
                           <m:rPr>
                             <m:sty m:val="p"/>
                           </m:rPr>
+                          <w:rPr>
+                            <w:highlight w:val="yellow"/>
+                          </w:rPr>
                           <m:t>c</m:t>
                         </m:r>
                         <m:r>
                           <m:rPr>
                             <m:sty m:val="p"/>
                           </m:rPr>
+                          <w:rPr>
+                            <w:highlight w:val="yellow"/>
+                          </w:rPr>
                           <m:t>m</m:t>
                         </m:r>
                       </m:e>
                       <m:sup>
                         <m:r>
+                          <w:rPr>
+                            <w:highlight w:val="yellow"/>
+                          </w:rPr>
                           <m:t>2</m:t>
                         </m:r>
                       </m:sup>
@@ -36951,21 +38094,36 @@
                       <m:rPr>
                         <m:sty m:val="p"/>
                       </m:rPr>
+                      <w:rPr>
+                        <w:highlight w:val="yellow"/>
+                      </w:rPr>
                       <m:t>≈</m:t>
                     </m:r>
                     <m:r>
+                      <w:rPr>
+                        <w:highlight w:val="yellow"/>
+                      </w:rPr>
                       <m:t>17</m:t>
                     </m:r>
                     <m:r>
                       <m:rPr>
                         <m:sty m:val="p"/>
                       </m:rPr>
+                      <w:rPr>
+                        <w:highlight w:val="yellow"/>
+                      </w:rPr>
                       <m:t>,</m:t>
                     </m:r>
                     <m:r>
+                      <w:rPr>
+                        <w:highlight w:val="yellow"/>
+                      </w:rPr>
                       <m:t>56</m:t>
                     </m:r>
                     <m:r>
+                      <w:rPr>
+                        <w:highlight w:val="yellow"/>
+                      </w:rPr>
                       <m:t> </m:t>
                     </m:r>
                     <m:sSup>
@@ -36974,17 +38132,26 @@
                           <m:rPr>
                             <m:sty m:val="p"/>
                           </m:rPr>
+                          <w:rPr>
+                            <w:highlight w:val="yellow"/>
+                          </w:rPr>
                           <m:t>c</m:t>
                         </m:r>
                         <m:r>
                           <m:rPr>
                             <m:sty m:val="p"/>
                           </m:rPr>
+                          <w:rPr>
+                            <w:highlight w:val="yellow"/>
+                          </w:rPr>
                           <m:t>m</m:t>
                         </m:r>
                       </m:e>
                       <m:sup>
                         <m:r>
+                          <w:rPr>
+                            <w:highlight w:val="yellow"/>
+                          </w:rPr>
                           <m:t>2</m:t>
                         </m:r>
                       </m:sup>
@@ -37110,11 +38277,17 @@
                       <m:sSup>
                         <m:e>
                           <m:r>
+                            <w:rPr>
+                              <w:highlight w:val="yellow"/>
+                            </w:rPr>
                             <m:t>e</m:t>
                           </m:r>
                         </m:e>
                         <m:sup>
                           <m:r>
+                            <w:rPr>
+                              <w:highlight w:val="yellow"/>
+                            </w:rPr>
                             <m:t>2</m:t>
                           </m:r>
                         </m:sup>
@@ -37123,14 +38296,23 @@
                         <m:rPr>
                           <m:sty m:val="p"/>
                         </m:rPr>
+                        <w:rPr>
+                          <w:highlight w:val="yellow"/>
+                        </w:rPr>
                         <m:t>−</m:t>
                       </m:r>
                       <m:r>
+                        <w:rPr>
+                          <w:highlight w:val="yellow"/>
+                        </w:rPr>
                         <m:t>3</m:t>
                       </m:r>
                     </m:num>
                     <m:den>
                       <m:r>
+                        <w:rPr>
+                          <w:highlight w:val="yellow"/>
+                        </w:rPr>
                         <m:t>2</m:t>
                       </m:r>
                     </m:den>
@@ -37139,18 +38321,30 @@
                     <m:rPr>
                       <m:sty m:val="p"/>
                     </m:rPr>
+                    <w:rPr>
+                      <w:highlight w:val="yellow"/>
+                    </w:rPr>
                     <m:t>≈</m:t>
                   </m:r>
                   <m:r>
+                    <w:rPr>
+                      <w:highlight w:val="yellow"/>
+                    </w:rPr>
                     <m:t>2</m:t>
                   </m:r>
                   <m:r>
                     <m:rPr>
                       <m:sty m:val="p"/>
                     </m:rPr>
+                    <w:rPr>
+                      <w:highlight w:val="yellow"/>
+                    </w:rPr>
                     <m:t>,</m:t>
                   </m:r>
                   <m:r>
+                    <w:rPr>
+                      <w:highlight w:val="yellow"/>
+                    </w:rPr>
                     <m:t>19</m:t>
                   </m:r>
                 </m:e>
@@ -38565,7 +39759,7 @@
               </w:rPr>
               <w:drawing>
                 <wp:inline>
-                  <wp:extent cx="3803904" cy="928115"/>
+                  <wp:extent cx="5623560" cy="1700784"/>
                   <wp:docPr id="14" name="Picture 14"/>
                   <wp:cNvGraphicFramePr>
                     <a:graphicFrameLocks noChangeAspect="1"/>
@@ -38574,7 +39768,7 @@
                     <a:graphicData uri="http://schemas.openxmlformats.org/drawingml/2006/picture">
                       <pic:pic>
                         <pic:nvPicPr>
-                          <pic:cNvPr id="0" name="94a549fd9f3b3c00.png"/>
+                          <pic:cNvPr id="0" name="1b2040d99027b49c.png"/>
                           <pic:cNvPicPr/>
                         </pic:nvPicPr>
                         <pic:blipFill>
@@ -38586,7 +39780,7 @@
                         <pic:spPr>
                           <a:xfrm>
                             <a:off x="0" y="0"/>
-                            <a:ext cx="3803904" cy="928115"/>
+                            <a:ext cx="5623560" cy="1700784"/>
                           </a:xfrm>
                           <a:prstGeom prst="rect"/>
                         </pic:spPr>
@@ -38872,6 +40066,9 @@
               <m:borderBox>
                 <m:e>
                   <m:r>
+                    <w:rPr>
+                      <w:highlight w:val="yellow"/>
+                    </w:rPr>
                     <m:t>G</m:t>
                   </m:r>
                   <m:d>
@@ -38883,6 +40080,9 @@
                     </m:dPr>
                     <m:e>
                       <m:r>
+                        <w:rPr>
+                          <w:highlight w:val="yellow"/>
+                        </w:rPr>
                         <m:t>x</m:t>
                       </m:r>
                     </m:e>
@@ -38891,6 +40091,9 @@
                     <m:rPr>
                       <m:sty m:val="p"/>
                     </m:rPr>
+                    <w:rPr>
+                      <w:highlight w:val="yellow"/>
+                    </w:rPr>
                     <m:t>=</m:t>
                   </m:r>
                   <m:f>
@@ -38899,11 +40102,17 @@
                     </m:fPr>
                     <m:num>
                       <m:r>
+                        <w:rPr>
+                          <w:highlight w:val="yellow"/>
+                        </w:rPr>
                         <m:t>1</m:t>
                       </m:r>
                     </m:num>
                     <m:den>
                       <m:r>
+                        <w:rPr>
+                          <w:highlight w:val="yellow"/>
+                        </w:rPr>
                         <m:t>2</m:t>
                       </m:r>
                     </m:den>
@@ -38922,9 +40131,15 @@
                             <m:rPr>
                               <m:sty m:val="p"/>
                             </m:rPr>
+                            <w:rPr>
+                              <w:highlight w:val="yellow"/>
+                            </w:rPr>
                             <m:t>ln</m:t>
                           </m:r>
                           <m:r>
+                            <w:rPr>
+                              <w:highlight w:val="yellow"/>
+                            </w:rPr>
                             <m:t>x</m:t>
                           </m:r>
                         </m:e>
@@ -38932,6 +40147,9 @@
                     </m:e>
                     <m:sup>
                       <m:r>
+                        <w:rPr>
+                          <w:highlight w:val="yellow"/>
+                        </w:rPr>
                         <m:t>2</m:t>
                       </m:r>
                     </m:sup>
@@ -39242,7 +40460,7 @@
                     <a:graphicData uri="http://schemas.openxmlformats.org/drawingml/2006/picture">
                       <pic:pic>
                         <pic:nvPicPr>
-                          <pic:cNvPr id="0" name="3a823ca3d2d2d771.png"/>
+                          <pic:cNvPr id="0" name="d1cf6e3ba0f11564.png"/>
                           <pic:cNvPicPr/>
                         </pic:nvPicPr>
                         <pic:blipFill>
@@ -40147,39 +41365,63 @@
                 <m:borderBox>
                   <m:e>
                     <m:r>
+                      <w:rPr>
+                        <w:highlight w:val="yellow"/>
+                      </w:rPr>
                       <m:t>1</m:t>
                     </m:r>
                     <m:r>
+                      <w:rPr>
+                        <w:highlight w:val="yellow"/>
+                      </w:rPr>
                       <m:t> </m:t>
                     </m:r>
                     <m:r>
                       <m:rPr>
                         <m:sty m:val="p"/>
                       </m:rPr>
+                      <w:rPr>
+                        <w:highlight w:val="yellow"/>
+                      </w:rPr>
                       <m:t>u</m:t>
                     </m:r>
                     <m:r>
                       <m:rPr>
                         <m:sty m:val="p"/>
                       </m:rPr>
+                      <w:rPr>
+                        <w:highlight w:val="yellow"/>
+                      </w:rPr>
                       <m:t>.</m:t>
                     </m:r>
                     <m:r>
                       <m:rPr>
                         <m:sty m:val="p"/>
                       </m:rPr>
+                      <w:rPr>
+                        <w:highlight w:val="yellow"/>
+                      </w:rPr>
                       <m:t>a</m:t>
                     </m:r>
                     <m:r>
                       <m:rPr>
                         <m:sty m:val="p"/>
                       </m:rPr>
+                      <w:rPr>
+                        <w:highlight w:val="yellow"/>
+                      </w:rPr>
                       <m:t>=</m:t>
                     </m:r>
                     <m:r>
+                      <w:rPr>
+                        <w:highlight w:val="yellow"/>
+                      </w:rPr>
                       <m:t>4</m:t>
                     </m:r>
                     <m:r>
+                      <w:rPr>
+                        <w:highlight w:val="yellow"/>
+                      </w:rPr>
                       <m:t> </m:t>
                     </m:r>
                     <m:sSup>
@@ -40188,17 +41430,26 @@
                           <m:rPr>
                             <m:sty m:val="p"/>
                           </m:rPr>
+                          <w:rPr>
+                            <w:highlight w:val="yellow"/>
+                          </w:rPr>
                           <m:t>c</m:t>
                         </m:r>
                         <m:r>
                           <m:rPr>
                             <m:sty m:val="p"/>
                           </m:rPr>
+                          <w:rPr>
+                            <w:highlight w:val="yellow"/>
+                          </w:rPr>
                           <m:t>m</m:t>
                         </m:r>
                       </m:e>
                       <m:sup>
                         <m:r>
+                          <w:rPr>
+                            <w:highlight w:val="yellow"/>
+                          </w:rPr>
                           <m:t>2</m:t>
                         </m:r>
                       </m:sup>
@@ -40621,11 +41872,17 @@
                       </m:fPr>
                       <m:num>
                         <m:r>
+                          <w:rPr>
+                            <w:highlight w:val="yellow"/>
+                          </w:rPr>
                           <m:t>1</m:t>
                         </m:r>
                       </m:num>
                       <m:den>
                         <m:r>
+                          <w:rPr>
+                            <w:highlight w:val="yellow"/>
+                          </w:rPr>
                           <m:t>2</m:t>
                         </m:r>
                       </m:den>
@@ -40644,9 +41901,15 @@
                               <m:rPr>
                                 <m:sty m:val="p"/>
                               </m:rPr>
+                              <w:rPr>
+                                <w:highlight w:val="yellow"/>
+                              </w:rPr>
                               <m:t>ln</m:t>
                             </m:r>
                             <m:r>
+                              <w:rPr>
+                                <w:highlight w:val="yellow"/>
+                              </w:rPr>
                               <m:t>λ</m:t>
                             </m:r>
                           </m:e>
@@ -40654,29 +41917,44 @@
                       </m:e>
                       <m:sup>
                         <m:r>
+                          <w:rPr>
+                            <w:highlight w:val="yellow"/>
+                          </w:rPr>
                           <m:t>2</m:t>
                         </m:r>
                       </m:sup>
                     </m:sSup>
                     <m:r>
+                      <w:rPr>
+                        <w:highlight w:val="yellow"/>
+                      </w:rPr>
                       <m:t> </m:t>
                     </m:r>
                     <m:r>
                       <m:rPr>
                         <m:sty m:val="p"/>
                       </m:rPr>
+                      <w:rPr>
+                        <w:highlight w:val="yellow"/>
+                      </w:rPr>
                       <m:t>u</m:t>
                     </m:r>
                     <m:r>
                       <m:rPr>
                         <m:sty m:val="p"/>
                       </m:rPr>
+                      <w:rPr>
+                        <w:highlight w:val="yellow"/>
+                      </w:rPr>
                       <m:t>.</m:t>
                     </m:r>
                     <m:r>
                       <m:rPr>
                         <m:sty m:val="p"/>
                       </m:rPr>
+                      <w:rPr>
+                        <w:highlight w:val="yellow"/>
+                      </w:rPr>
                       <m:t>a</m:t>
                     </m:r>
                   </m:e>
@@ -40872,22 +42150,34 @@
               <m:borderBox>
                 <m:e>
                   <m:r>
+                    <w:rPr>
+                      <w:highlight w:val="yellow"/>
+                    </w:rPr>
                     <m:t>λ</m:t>
                   </m:r>
                   <m:r>
                     <m:rPr>
                       <m:sty m:val="p"/>
                     </m:rPr>
+                    <w:rPr>
+                      <w:highlight w:val="yellow"/>
+                    </w:rPr>
                     <m:t>=</m:t>
                   </m:r>
                   <m:sSup>
                     <m:e>
                       <m:r>
+                        <w:rPr>
+                          <w:highlight w:val="yellow"/>
+                        </w:rPr>
                         <m:t>e</m:t>
                       </m:r>
                     </m:e>
                     <m:sup>
                       <m:r>
+                        <w:rPr>
+                          <w:highlight w:val="yellow"/>
+                        </w:rPr>
                         <m:t>2</m:t>
                       </m:r>
                     </m:sup>
@@ -43814,8 +45104,8 @@
     </w:pPr>
     <w:rPr>
       <w:rFonts w:ascii="Amiri" w:cs="Amiri" w:eastAsia="Amiri" w:hAnsi="Amiri"/>
-      <w:sz w:val="26"/>
-      <w:szCs w:val="26"/>
+      <w:sz w:val="28"/>
+      <w:szCs w:val="28"/>
       <w:lang w:bidi="ar-DZ" w:val="fr-FR"/>
     </w:rPr>
   </w:style>

</xml_diff>